<commit_message>
Added Contact us and styles
</commit_message>
<xml_diff>
--- a/Final-Term Project-DevOps-Fall2024.docx
+++ b/Final-Term Project-DevOps-Fall2024.docx
@@ -561,27 +561,8 @@
                 <w:rFonts w:ascii="Calibri" w:hAnsi="Calibri" w:cs="Calibri"/>
                 <w:b/>
                 <w:bCs/>
-                <w:color w:val="FF0000"/>
-              </w:rPr>
-              <w:t>[</w:t>
-            </w:r>
-            <w:r>
-              <w:rPr>
-                <w:rFonts w:ascii="Calibri" w:hAnsi="Calibri" w:cs="Calibri"/>
-                <w:b/>
-                <w:bCs/>
-                <w:color w:val="FF0000"/>
-              </w:rPr>
-              <w:t xml:space="preserve">Paste Group Repository </w:t>
-            </w:r>
-            <w:r>
-              <w:rPr>
-                <w:rFonts w:ascii="Calibri" w:hAnsi="Calibri" w:cs="Calibri"/>
-                <w:b/>
-                <w:bCs/>
-                <w:color w:val="FF0000"/>
-              </w:rPr>
-              <w:t>URL Here]</w:t>
+              </w:rPr>
+              <w:t>https://github.com/umansheikh0611/term-project-f24/</w:t>
             </w:r>
           </w:p>
         </w:tc>
@@ -610,16 +591,7 @@
                 <w:b/>
                 <w:bCs/>
               </w:rPr>
-              <w:t>Website URL</w:t>
-            </w:r>
-            <w:proofErr w:type="gramStart"/>
-            <w:r>
-              <w:rPr>
-                <w:rFonts w:ascii="Calibri" w:hAnsi="Calibri" w:cs="Calibri"/>
-                <w:b/>
-                <w:bCs/>
-              </w:rPr>
-              <w:t xml:space="preserve">:  </w:t>
+              <w:t xml:space="preserve">Website URL:  </w:t>
             </w:r>
             <w:r>
               <w:rPr>
@@ -630,7 +602,6 @@
               </w:rPr>
               <w:t>[</w:t>
             </w:r>
-            <w:proofErr w:type="gramEnd"/>
             <w:r>
               <w:rPr>
                 <w:rFonts w:ascii="Calibri" w:hAnsi="Calibri" w:cs="Calibri"/>
@@ -812,18 +783,8 @@
                 <w:b/>
                 <w:bCs/>
               </w:rPr>
-              <w:t xml:space="preserve"> worked </w:t>
-            </w:r>
-            <w:proofErr w:type="gramStart"/>
-            <w:r>
-              <w:rPr>
-                <w:rFonts w:ascii="Calibri" w:hAnsi="Calibri" w:cs="Calibri"/>
-                <w:b/>
-                <w:bCs/>
-              </w:rPr>
-              <w:t>On</w:t>
-            </w:r>
-            <w:proofErr w:type="gramEnd"/>
+              <w:t xml:space="preserve"> worked On</w:t>
+            </w:r>
           </w:p>
         </w:tc>
       </w:tr>
@@ -916,6 +877,130 @@
                 <w:rFonts w:ascii="Calibri" w:hAnsi="Calibri" w:cs="Calibri"/>
               </w:rPr>
               <w:t>Team Lead</w:t>
+            </w:r>
+          </w:p>
+        </w:tc>
+        <w:tc>
+          <w:tcPr>
+            <w:tcW w:w="2160" w:type="dxa"/>
+          </w:tcPr>
+          <w:p>
+            <w:pPr>
+              <w:rPr>
+                <w:rFonts w:ascii="Calibri" w:hAnsi="Calibri" w:cs="Calibri"/>
+              </w:rPr>
+            </w:pPr>
+            <w:r>
+              <w:rPr>
+                <w:rFonts w:ascii="Calibri" w:hAnsi="Calibri" w:cs="Calibri"/>
+              </w:rPr>
+              <w:t>workflows</w:t>
+            </w:r>
+          </w:p>
+          <w:p>
+            <w:pPr>
+              <w:rPr>
+                <w:rFonts w:ascii="Calibri" w:hAnsi="Calibri" w:cs="Calibri"/>
+              </w:rPr>
+            </w:pPr>
+            <w:r>
+              <w:rPr>
+                <w:rFonts w:ascii="Calibri" w:hAnsi="Calibri" w:cs="Calibri"/>
+              </w:rPr>
+              <w:t>feature/contact-us</w:t>
+            </w:r>
+          </w:p>
+        </w:tc>
+      </w:tr>
+      <w:tr>
+        <w:trPr>
+          <w:trHeight w:val="458"/>
+        </w:trPr>
+        <w:tc>
+          <w:tcPr>
+            <w:tcW w:w="625" w:type="dxa"/>
+            <w:vAlign w:val="center"/>
+          </w:tcPr>
+          <w:p>
+            <w:pPr>
+              <w:jc w:val="center"/>
+              <w:rPr>
+                <w:rFonts w:ascii="Calibri" w:hAnsi="Calibri" w:cs="Calibri"/>
+                <w:b/>
+                <w:bCs/>
+              </w:rPr>
+            </w:pPr>
+            <w:r>
+              <w:rPr>
+                <w:rFonts w:ascii="Calibri" w:hAnsi="Calibri" w:cs="Calibri"/>
+                <w:b/>
+                <w:bCs/>
+              </w:rPr>
+              <w:t>2</w:t>
+            </w:r>
+          </w:p>
+        </w:tc>
+        <w:tc>
+          <w:tcPr>
+            <w:tcW w:w="2520" w:type="dxa"/>
+            <w:vAlign w:val="center"/>
+          </w:tcPr>
+          <w:p>
+            <w:pPr>
+              <w:rPr>
+                <w:rFonts w:ascii="Calibri" w:hAnsi="Calibri" w:cs="Calibri"/>
+                <w:b/>
+                <w:bCs/>
+              </w:rPr>
+            </w:pPr>
+            <w:r>
+              <w:rPr>
+                <w:rFonts w:ascii="Calibri" w:hAnsi="Calibri" w:cs="Calibri"/>
+                <w:b/>
+                <w:bCs/>
+              </w:rPr>
+              <w:t>Mazhar Rehan</w:t>
+            </w:r>
+          </w:p>
+        </w:tc>
+        <w:tc>
+          <w:tcPr>
+            <w:tcW w:w="2520" w:type="dxa"/>
+            <w:vAlign w:val="center"/>
+          </w:tcPr>
+          <w:p>
+            <w:pPr>
+              <w:rPr>
+                <w:rFonts w:ascii="Calibri" w:hAnsi="Calibri" w:cs="Calibri"/>
+                <w:b/>
+                <w:bCs/>
+              </w:rPr>
+            </w:pPr>
+            <w:r>
+              <w:rPr>
+                <w:rFonts w:ascii="Calibri" w:hAnsi="Calibri" w:cs="Calibri"/>
+                <w:b/>
+                <w:bCs/>
+              </w:rPr>
+              <w:t>L1F21BSSE0183</w:t>
+            </w:r>
+          </w:p>
+        </w:tc>
+        <w:tc>
+          <w:tcPr>
+            <w:tcW w:w="1620" w:type="dxa"/>
+          </w:tcPr>
+          <w:p>
+            <w:pPr>
+              <w:rPr>
+                <w:rFonts w:ascii="Calibri" w:hAnsi="Calibri" w:cs="Calibri"/>
+              </w:rPr>
+            </w:pPr>
+            <w:r>
+              <w:rPr>
+                <w:rFonts w:ascii="Calibri" w:hAnsi="Calibri" w:cs="Calibri"/>
+              </w:rPr>
+              <w:t>Team Member</w:t>
             </w:r>
           </w:p>
         </w:tc>
@@ -956,7 +1041,7 @@
                 <w:b/>
                 <w:bCs/>
               </w:rPr>
-              <w:t>2</w:t>
+              <w:t>3</w:t>
             </w:r>
           </w:p>
         </w:tc>
@@ -979,7 +1064,7 @@
                 <w:b/>
                 <w:bCs/>
               </w:rPr>
-              <w:t>Mazhar Rehan</w:t>
+              <w:t>Zain Bin Imran</w:t>
             </w:r>
           </w:p>
         </w:tc>
@@ -1002,7 +1087,7 @@
                 <w:b/>
                 <w:bCs/>
               </w:rPr>
-              <w:t>L1F21BSSE0183</w:t>
+              <w:t>L1F21BSSE0539</w:t>
             </w:r>
           </w:p>
         </w:tc>
@@ -1061,7 +1146,7 @@
                 <w:b/>
                 <w:bCs/>
               </w:rPr>
-              <w:t>3</w:t>
+              <w:t>4</w:t>
             </w:r>
           </w:p>
         </w:tc>
@@ -1084,7 +1169,7 @@
                 <w:b/>
                 <w:bCs/>
               </w:rPr>
-              <w:t>Zain Bin Imran</w:t>
+              <w:t>Usama Bin Naseer</w:t>
             </w:r>
           </w:p>
         </w:tc>
@@ -1107,7 +1192,7 @@
                 <w:b/>
                 <w:bCs/>
               </w:rPr>
-              <w:t>L1F21BSSE0539</w:t>
+              <w:t>L1F21BSSE0540</w:t>
             </w:r>
           </w:p>
         </w:tc>
@@ -1166,7 +1251,7 @@
                 <w:b/>
                 <w:bCs/>
               </w:rPr>
-              <w:t>4</w:t>
+              <w:t>5</w:t>
             </w:r>
           </w:p>
         </w:tc>
@@ -1189,7 +1274,7 @@
                 <w:b/>
                 <w:bCs/>
               </w:rPr>
-              <w:t>Usama Bin Naseer</w:t>
+              <w:t>Hafiz Faizan</w:t>
             </w:r>
           </w:p>
         </w:tc>
@@ -1212,7 +1297,7 @@
                 <w:b/>
                 <w:bCs/>
               </w:rPr>
-              <w:t>L1F21BSSE0540</w:t>
+              <w:t>L1F21BSSE0030</w:t>
             </w:r>
           </w:p>
         </w:tc>
@@ -1271,111 +1356,6 @@
                 <w:b/>
                 <w:bCs/>
               </w:rPr>
-              <w:t>5</w:t>
-            </w:r>
-          </w:p>
-        </w:tc>
-        <w:tc>
-          <w:tcPr>
-            <w:tcW w:w="2520" w:type="dxa"/>
-            <w:vAlign w:val="center"/>
-          </w:tcPr>
-          <w:p>
-            <w:pPr>
-              <w:rPr>
-                <w:rFonts w:ascii="Calibri" w:hAnsi="Calibri" w:cs="Calibri"/>
-                <w:b/>
-                <w:bCs/>
-              </w:rPr>
-            </w:pPr>
-            <w:r>
-              <w:rPr>
-                <w:rFonts w:ascii="Calibri" w:hAnsi="Calibri" w:cs="Calibri"/>
-                <w:b/>
-                <w:bCs/>
-              </w:rPr>
-              <w:t>Hafiz Faizan</w:t>
-            </w:r>
-          </w:p>
-        </w:tc>
-        <w:tc>
-          <w:tcPr>
-            <w:tcW w:w="2520" w:type="dxa"/>
-            <w:vAlign w:val="center"/>
-          </w:tcPr>
-          <w:p>
-            <w:pPr>
-              <w:rPr>
-                <w:rFonts w:ascii="Calibri" w:hAnsi="Calibri" w:cs="Calibri"/>
-                <w:b/>
-                <w:bCs/>
-              </w:rPr>
-            </w:pPr>
-            <w:r>
-              <w:rPr>
-                <w:rFonts w:ascii="Calibri" w:hAnsi="Calibri" w:cs="Calibri"/>
-                <w:b/>
-                <w:bCs/>
-              </w:rPr>
-              <w:t>L1F21BSSE0030</w:t>
-            </w:r>
-          </w:p>
-        </w:tc>
-        <w:tc>
-          <w:tcPr>
-            <w:tcW w:w="1620" w:type="dxa"/>
-          </w:tcPr>
-          <w:p>
-            <w:pPr>
-              <w:rPr>
-                <w:rFonts w:ascii="Calibri" w:hAnsi="Calibri" w:cs="Calibri"/>
-              </w:rPr>
-            </w:pPr>
-            <w:r>
-              <w:rPr>
-                <w:rFonts w:ascii="Calibri" w:hAnsi="Calibri" w:cs="Calibri"/>
-              </w:rPr>
-              <w:t>Team Member</w:t>
-            </w:r>
-          </w:p>
-        </w:tc>
-        <w:tc>
-          <w:tcPr>
-            <w:tcW w:w="2160" w:type="dxa"/>
-          </w:tcPr>
-          <w:p>
-            <w:pPr>
-              <w:rPr>
-                <w:rFonts w:ascii="Calibri" w:hAnsi="Calibri" w:cs="Calibri"/>
-              </w:rPr>
-            </w:pPr>
-          </w:p>
-        </w:tc>
-      </w:tr>
-      <w:tr>
-        <w:trPr>
-          <w:trHeight w:val="458"/>
-        </w:trPr>
-        <w:tc>
-          <w:tcPr>
-            <w:tcW w:w="625" w:type="dxa"/>
-            <w:vAlign w:val="center"/>
-          </w:tcPr>
-          <w:p>
-            <w:pPr>
-              <w:jc w:val="center"/>
-              <w:rPr>
-                <w:rFonts w:ascii="Calibri" w:hAnsi="Calibri" w:cs="Calibri"/>
-                <w:b/>
-                <w:bCs/>
-              </w:rPr>
-            </w:pPr>
-            <w:r>
-              <w:rPr>
-                <w:rFonts w:ascii="Calibri" w:hAnsi="Calibri" w:cs="Calibri"/>
-                <w:b/>
-                <w:bCs/>
-              </w:rPr>
               <w:t>6</w:t>
             </w:r>
           </w:p>
@@ -2612,17 +2592,8 @@
           <w:sz w:val="24"/>
           <w:szCs w:val="24"/>
         </w:rPr>
-        <w:t xml:space="preserve"> for each </w:t>
-      </w:r>
-      <w:proofErr w:type="spellStart"/>
-      <w:r>
-        <w:rPr>
-          <w:sz w:val="24"/>
-          <w:szCs w:val="24"/>
-        </w:rPr>
-        <w:t>environemtn</w:t>
-      </w:r>
-      <w:proofErr w:type="spellEnd"/>
+        <w:t xml:space="preserve"> for each environemtn</w:t>
+      </w:r>
       <w:r>
         <w:rPr>
           <w:sz w:val="24"/>
@@ -3691,7 +3662,6 @@
         <w:br/>
         <w:t>5.2. Develop the HTML and CSS files for the assigned page, adhering to linting rules (</w:t>
       </w:r>
-      <w:proofErr w:type="spellStart"/>
       <w:r>
         <w:rPr>
           <w:b/>
@@ -3701,7 +3671,6 @@
         </w:rPr>
         <w:t>HTMLHint</w:t>
       </w:r>
-      <w:proofErr w:type="spellEnd"/>
       <w:r>
         <w:rPr>
           <w:sz w:val="24"/>
@@ -3709,7 +3678,6 @@
         </w:rPr>
         <w:t xml:space="preserve"> and </w:t>
       </w:r>
-      <w:proofErr w:type="spellStart"/>
       <w:r>
         <w:rPr>
           <w:b/>
@@ -3719,7 +3687,6 @@
         </w:rPr>
         <w:t>Stylelint</w:t>
       </w:r>
-      <w:proofErr w:type="spellEnd"/>
       <w:r>
         <w:rPr>
           <w:sz w:val="24"/>

</xml_diff>

<commit_message>
Modify project Docx file
</commit_message>
<xml_diff>
--- a/Final-Term Project-DevOps-Fall2024.docx
+++ b/Final-Term Project-DevOps-Fall2024.docx
@@ -1,6 +1,6 @@
 
 <file path=word/document.xml><?xml version="1.0" encoding="utf-8"?>
-<w:document xmlns:wpc="http://schemas.microsoft.com/office/word/2010/wordprocessingCanvas" xmlns:cx="http://schemas.microsoft.com/office/drawing/2014/chartex" xmlns:cx1="http://schemas.microsoft.com/office/drawing/2015/9/8/chartex" xmlns:cx2="http://schemas.microsoft.com/office/drawing/2015/10/21/chartex" xmlns:cx3="http://schemas.microsoft.com/office/drawing/2016/5/9/chartex" xmlns:cx4="http://schemas.microsoft.com/office/drawing/2016/5/10/chartex" xmlns:cx5="http://schemas.microsoft.com/office/drawing/2016/5/11/chartex" xmlns:cx6="http://schemas.microsoft.com/office/drawing/2016/5/12/chartex" xmlns:cx7="http://schemas.microsoft.com/office/drawing/2016/5/13/chartex" xmlns:cx8="http://schemas.microsoft.com/office/drawing/2016/5/14/chartex" xmlns:mc="http://schemas.openxmlformats.org/markup-compatibility/2006" xmlns:aink="http://schemas.microsoft.com/office/drawing/2016/ink" xmlns:am3d="http://schemas.microsoft.com/office/drawing/2017/model3d" xmlns:o="urn:schemas-microsoft-com:office:office" xmlns:oel="http://schemas.microsoft.com/office/2019/extlst" xmlns:r="http://schemas.openxmlformats.org/officeDocument/2006/relationships" xmlns:m="http://schemas.openxmlformats.org/officeDocument/2006/math" xmlns:v="urn:schemas-microsoft-com:vml" xmlns:wp14="http://schemas.microsoft.com/office/word/2010/wordprocessingDrawing" xmlns:wp="http://schemas.openxmlformats.org/drawingml/2006/wordprocessingDrawing" xmlns:w10="urn:schemas-microsoft-com:office:word" xmlns:w="http://schemas.openxmlformats.org/wordprocessingml/2006/main" xmlns:w14="http://schemas.microsoft.com/office/word/2010/wordml" xmlns:w15="http://schemas.microsoft.com/office/word/2012/wordml" xmlns:w16cex="http://schemas.microsoft.com/office/word/2018/wordml/cex" xmlns:w16cid="http://schemas.microsoft.com/office/word/2016/wordml/cid" xmlns:w16="http://schemas.microsoft.com/office/word/2018/wordml" xmlns:w16du="http://schemas.microsoft.com/office/word/2023/wordml/word16du" xmlns:w16sdtdh="http://schemas.microsoft.com/office/word/2020/wordml/sdtdatahash" xmlns:w16sdtfl="http://schemas.microsoft.com/office/word/2024/wordml/sdtformatlock" xmlns:w16se="http://schemas.microsoft.com/office/word/2015/wordml/symex" xmlns:wpg="http://schemas.microsoft.com/office/word/2010/wordprocessingGroup" xmlns:wpi="http://schemas.microsoft.com/office/word/2010/wordprocessingInk" xmlns:wne="http://schemas.microsoft.com/office/word/2006/wordml" xmlns:wps="http://schemas.microsoft.com/office/word/2010/wordprocessingShape" mc:Ignorable="w14 w15 w16se w16cid w16 w16cex w16sdtdh w16sdtfl w16du wp14">
+<w:document xmlns:wpc="http://schemas.microsoft.com/office/word/2010/wordprocessingCanvas" xmlns:cx="http://schemas.microsoft.com/office/drawing/2014/chartex" xmlns:cx1="http://schemas.microsoft.com/office/drawing/2015/9/8/chartex" xmlns:cx2="http://schemas.microsoft.com/office/drawing/2015/10/21/chartex" xmlns:cx3="http://schemas.microsoft.com/office/drawing/2016/5/9/chartex" xmlns:cx4="http://schemas.microsoft.com/office/drawing/2016/5/10/chartex" xmlns:cx5="http://schemas.microsoft.com/office/drawing/2016/5/11/chartex" xmlns:cx6="http://schemas.microsoft.com/office/drawing/2016/5/12/chartex" xmlns:cx7="http://schemas.microsoft.com/office/drawing/2016/5/13/chartex" xmlns:cx8="http://schemas.microsoft.com/office/drawing/2016/5/14/chartex" xmlns:mc="http://schemas.openxmlformats.org/markup-compatibility/2006" xmlns:aink="http://schemas.microsoft.com/office/drawing/2016/ink" xmlns:am3d="http://schemas.microsoft.com/office/drawing/2017/model3d" xmlns:o="urn:schemas-microsoft-com:office:office" xmlns:r="http://schemas.openxmlformats.org/officeDocument/2006/relationships" xmlns:m="http://schemas.openxmlformats.org/officeDocument/2006/math" xmlns:v="urn:schemas-microsoft-com:vml" xmlns:wp14="http://schemas.microsoft.com/office/word/2010/wordprocessingDrawing" xmlns:wp="http://schemas.openxmlformats.org/drawingml/2006/wordprocessingDrawing" xmlns:w10="urn:schemas-microsoft-com:office:word" xmlns:w="http://schemas.openxmlformats.org/wordprocessingml/2006/main" xmlns:w14="http://schemas.microsoft.com/office/word/2010/wordml" xmlns:w15="http://schemas.microsoft.com/office/word/2012/wordml" xmlns:w16cex="http://schemas.microsoft.com/office/word/2018/wordml/cex" xmlns:w16cid="http://schemas.microsoft.com/office/word/2016/wordml/cid" xmlns:w16="http://schemas.microsoft.com/office/word/2018/wordml" xmlns:w16sdtdh="http://schemas.microsoft.com/office/word/2020/wordml/sdtdatahash" xmlns:w16se="http://schemas.microsoft.com/office/word/2015/wordml/symex" xmlns:wpg="http://schemas.microsoft.com/office/word/2010/wordprocessingGroup" xmlns:wpi="http://schemas.microsoft.com/office/word/2010/wordprocessingInk" xmlns:wne="http://schemas.microsoft.com/office/word/2006/wordml" xmlns:wps="http://schemas.microsoft.com/office/word/2010/wordprocessingShape" mc:Ignorable="w14 w15 w16se w16cid w16 w16cex w16sdtdh wp14">
   <w:body>
     <w:p>
       <w:pPr>
@@ -508,14 +508,27 @@
       <w:r>
         <w:t xml:space="preserve">Table </w:t>
       </w:r>
-      <w:fldSimple w:instr=" SEQ Table \* ARABIC ">
-        <w:r>
-          <w:rPr>
-            <w:noProof/>
-          </w:rPr>
-          <w:t>1</w:t>
-        </w:r>
-      </w:fldSimple>
+      <w:r>
+        <w:fldChar w:fldCharType="begin"/>
+      </w:r>
+      <w:r>
+        <w:instrText xml:space="preserve"> SEQ Table \* ARABIC </w:instrText>
+      </w:r>
+      <w:r>
+        <w:fldChar w:fldCharType="separate"/>
+      </w:r>
+      <w:r>
+        <w:rPr>
+          <w:noProof/>
+        </w:rPr>
+        <w:t>1</w:t>
+      </w:r>
+      <w:r>
+        <w:rPr>
+          <w:noProof/>
+        </w:rPr>
+        <w:fldChar w:fldCharType="end"/>
+      </w:r>
     </w:p>
     <w:tbl>
       <w:tblPr>
@@ -524,11 +537,11 @@
         <w:tblLook w:val="04A0" w:firstRow="1" w:lastRow="0" w:firstColumn="1" w:lastColumn="0" w:noHBand="0" w:noVBand="1"/>
       </w:tblPr>
       <w:tblGrid>
-        <w:gridCol w:w="625"/>
-        <w:gridCol w:w="2520"/>
-        <w:gridCol w:w="2520"/>
-        <w:gridCol w:w="1620"/>
-        <w:gridCol w:w="2160"/>
+        <w:gridCol w:w="571"/>
+        <w:gridCol w:w="2241"/>
+        <w:gridCol w:w="2310"/>
+        <w:gridCol w:w="1472"/>
+        <w:gridCol w:w="2851"/>
       </w:tblGrid>
       <w:tr>
         <w:trPr>
@@ -556,13 +569,24 @@
               </w:rPr>
               <w:t xml:space="preserve">Group Repository URL: </w:t>
             </w:r>
-            <w:r>
-              <w:rPr>
-                <w:rFonts w:ascii="Calibri" w:hAnsi="Calibri" w:cs="Calibri"/>
-                <w:b/>
-                <w:bCs/>
-              </w:rPr>
-              <w:t>https://github.com/umansheikh0611/term-project-f24/</w:t>
+            <w:hyperlink r:id="rId7" w:history="1">
+              <w:r>
+                <w:rPr>
+                  <w:rStyle w:val="Hyperlink"/>
+                  <w:rFonts w:ascii="Calibri" w:hAnsi="Calibri" w:cs="Calibri"/>
+                  <w:b/>
+                  <w:bCs/>
+                </w:rPr>
+                <w:t>https://github.com/umansheikh0611/term-project-f24/</w:t>
+              </w:r>
+            </w:hyperlink>
+            <w:r>
+              <w:rPr>
+                <w:rFonts w:ascii="Calibri" w:hAnsi="Calibri" w:cs="Calibri"/>
+                <w:b/>
+                <w:bCs/>
+              </w:rPr>
+              <w:t xml:space="preserve"> </w:t>
             </w:r>
           </w:p>
         </w:tc>
@@ -591,34 +615,34 @@
                 <w:b/>
                 <w:bCs/>
               </w:rPr>
-              <w:t xml:space="preserve">Website URL:  </w:t>
-            </w:r>
-            <w:r>
-              <w:rPr>
-                <w:rFonts w:ascii="Calibri" w:hAnsi="Calibri" w:cs="Calibri"/>
-                <w:b/>
-                <w:bCs/>
-                <w:color w:val="FF0000"/>
-              </w:rPr>
-              <w:t>[</w:t>
-            </w:r>
-            <w:r>
-              <w:rPr>
-                <w:rFonts w:ascii="Calibri" w:hAnsi="Calibri" w:cs="Calibri"/>
-                <w:b/>
-                <w:bCs/>
-                <w:color w:val="FF0000"/>
-              </w:rPr>
-              <w:t xml:space="preserve">Paste Your Website </w:t>
-            </w:r>
-            <w:r>
-              <w:rPr>
-                <w:rFonts w:ascii="Calibri" w:hAnsi="Calibri" w:cs="Calibri"/>
-                <w:b/>
-                <w:bCs/>
-                <w:color w:val="FF0000"/>
-              </w:rPr>
-              <w:t>URL Here]</w:t>
+              <w:t>Website URL:</w:t>
+            </w:r>
+            <w:r>
+              <w:rPr>
+                <w:rFonts w:ascii="Calibri" w:hAnsi="Calibri" w:cs="Calibri"/>
+                <w:b/>
+                <w:bCs/>
+              </w:rPr>
+              <w:t xml:space="preserve">  </w:t>
+            </w:r>
+            <w:hyperlink r:id="rId8" w:history="1">
+              <w:r>
+                <w:rPr>
+                  <w:rStyle w:val="Hyperlink"/>
+                  <w:rFonts w:ascii="Calibri" w:hAnsi="Calibri" w:cs="Calibri"/>
+                  <w:b/>
+                  <w:bCs/>
+                </w:rPr>
+                <w:t>https://umansheikh0611.github.io/term-project-f24</w:t>
+              </w:r>
+            </w:hyperlink>
+            <w:r>
+              <w:rPr>
+                <w:rFonts w:ascii="Calibri" w:hAnsi="Calibri" w:cs="Calibri"/>
+                <w:b/>
+                <w:bCs/>
+              </w:rPr>
+              <w:t xml:space="preserve"> </w:t>
             </w:r>
           </w:p>
         </w:tc>
@@ -783,8 +807,18 @@
                 <w:b/>
                 <w:bCs/>
               </w:rPr>
-              <w:t xml:space="preserve"> worked On</w:t>
-            </w:r>
+              <w:t xml:space="preserve"> worked </w:t>
+            </w:r>
+            <w:proofErr w:type="gramStart"/>
+            <w:r>
+              <w:rPr>
+                <w:rFonts w:ascii="Calibri" w:hAnsi="Calibri" w:cs="Calibri"/>
+                <w:b/>
+                <w:bCs/>
+              </w:rPr>
+              <w:t>On</w:t>
+            </w:r>
+            <w:proofErr w:type="gramEnd"/>
           </w:p>
         </w:tc>
       </w:tr>
@@ -883,6 +917,12 @@
         <w:tc>
           <w:tcPr>
             <w:tcW w:w="2160" w:type="dxa"/>
+            <w:tcBorders>
+              <w:top w:val="single" w:sz="4" w:space="0" w:color="auto"/>
+              <w:left w:val="single" w:sz="4" w:space="0" w:color="auto"/>
+              <w:bottom w:val="single" w:sz="4" w:space="0" w:color="auto"/>
+              <w:right w:val="single" w:sz="4" w:space="0" w:color="auto"/>
+            </w:tcBorders>
           </w:tcPr>
           <w:p>
             <w:pPr>
@@ -910,86 +950,45 @@
               <w:t>feature/contact-us</w:t>
             </w:r>
           </w:p>
-        </w:tc>
-      </w:tr>
-      <w:tr>
-        <w:trPr>
-          <w:trHeight w:val="458"/>
-        </w:trPr>
-        <w:tc>
-          <w:tcPr>
-            <w:tcW w:w="625" w:type="dxa"/>
-            <w:vAlign w:val="center"/>
-          </w:tcPr>
           <w:p>
             <w:pPr>
-              <w:jc w:val="center"/>
-              <w:rPr>
-                <w:rFonts w:ascii="Calibri" w:hAnsi="Calibri" w:cs="Calibri"/>
-                <w:b/>
-                <w:bCs/>
+              <w:rPr>
+                <w:rFonts w:ascii="Calibri" w:hAnsi="Calibri" w:cs="Calibri"/>
               </w:rPr>
             </w:pPr>
             <w:r>
               <w:rPr>
                 <w:rFonts w:ascii="Calibri" w:hAnsi="Calibri" w:cs="Calibri"/>
-                <w:b/>
-                <w:bCs/>
-              </w:rPr>
-              <w:t>2</w:t>
+              </w:rPr>
+              <w:t>release</w:t>
             </w:r>
           </w:p>
-        </w:tc>
-        <w:tc>
-          <w:tcPr>
-            <w:tcW w:w="2520" w:type="dxa"/>
-            <w:vAlign w:val="center"/>
-          </w:tcPr>
           <w:p>
             <w:pPr>
               <w:rPr>
                 <w:rFonts w:ascii="Calibri" w:hAnsi="Calibri" w:cs="Calibri"/>
-                <w:b/>
-                <w:bCs/>
               </w:rPr>
             </w:pPr>
             <w:r>
               <w:rPr>
                 <w:rFonts w:ascii="Calibri" w:hAnsi="Calibri" w:cs="Calibri"/>
-                <w:b/>
-                <w:bCs/>
-              </w:rPr>
-              <w:t>Mazhar Rehan</w:t>
+              </w:rPr>
+              <w:t>production</w:t>
             </w:r>
           </w:p>
-        </w:tc>
-        <w:tc>
-          <w:tcPr>
-            <w:tcW w:w="2520" w:type="dxa"/>
-            <w:vAlign w:val="center"/>
-          </w:tcPr>
           <w:p>
             <w:pPr>
               <w:rPr>
                 <w:rFonts w:ascii="Calibri" w:hAnsi="Calibri" w:cs="Calibri"/>
-                <w:b/>
-                <w:bCs/>
               </w:rPr>
             </w:pPr>
             <w:r>
               <w:rPr>
                 <w:rFonts w:ascii="Calibri" w:hAnsi="Calibri" w:cs="Calibri"/>
-                <w:b/>
-                <w:bCs/>
-              </w:rPr>
-              <w:t>L1F21BSSE0183</w:t>
+              </w:rPr>
+              <w:t>staging</w:t>
             </w:r>
           </w:p>
-        </w:tc>
-        <w:tc>
-          <w:tcPr>
-            <w:tcW w:w="1620" w:type="dxa"/>
-          </w:tcPr>
           <w:p>
             <w:pPr>
               <w:rPr>
@@ -1000,14 +999,9 @@
               <w:rPr>
                 <w:rFonts w:ascii="Calibri" w:hAnsi="Calibri" w:cs="Calibri"/>
               </w:rPr>
-              <w:t>Team Member</w:t>
+              <w:t>hotfix/config</w:t>
             </w:r>
           </w:p>
-        </w:tc>
-        <w:tc>
-          <w:tcPr>
-            <w:tcW w:w="2160" w:type="dxa"/>
-          </w:tcPr>
           <w:p>
             <w:pPr>
               <w:rPr>
@@ -1041,7 +1035,7 @@
                 <w:b/>
                 <w:bCs/>
               </w:rPr>
-              <w:t>3</w:t>
+              <w:t>2</w:t>
             </w:r>
           </w:p>
         </w:tc>
@@ -1064,7 +1058,7 @@
                 <w:b/>
                 <w:bCs/>
               </w:rPr>
-              <w:t>Zain Bin Imran</w:t>
+              <w:t>Mazhar Rehan</w:t>
             </w:r>
           </w:p>
         </w:tc>
@@ -1087,7 +1081,7 @@
                 <w:b/>
                 <w:bCs/>
               </w:rPr>
-              <w:t>L1F21BSSE0539</w:t>
+              <w:t>L1F21BSSE0183</w:t>
             </w:r>
           </w:p>
         </w:tc>
@@ -1112,13 +1106,121 @@
         <w:tc>
           <w:tcPr>
             <w:tcW w:w="2160" w:type="dxa"/>
+            <w:tcBorders>
+              <w:top w:val="single" w:sz="4" w:space="0" w:color="auto"/>
+              <w:left w:val="single" w:sz="4" w:space="0" w:color="auto"/>
+              <w:bottom w:val="single" w:sz="4" w:space="0" w:color="auto"/>
+              <w:right w:val="single" w:sz="4" w:space="0" w:color="auto"/>
+            </w:tcBorders>
           </w:tcPr>
           <w:p>
             <w:pPr>
+              <w:pStyle w:val="ListParagraph"/>
+              <w:numPr>
+                <w:ilvl w:val="0"/>
+                <w:numId w:val="15"/>
+              </w:numPr>
               <w:rPr>
                 <w:rFonts w:ascii="Calibri" w:hAnsi="Calibri" w:cs="Calibri"/>
               </w:rPr>
             </w:pPr>
+            <w:r>
+              <w:rPr>
+                <w:rFonts w:ascii="Calibri" w:hAnsi="Calibri" w:cs="Calibri"/>
+              </w:rPr>
+              <w:t>f</w:t>
+            </w:r>
+            <w:r>
+              <w:rPr>
+                <w:rFonts w:ascii="Calibri" w:hAnsi="Calibri" w:cs="Calibri"/>
+              </w:rPr>
+              <w:t>eature/blog-page</w:t>
+            </w:r>
+          </w:p>
+          <w:p>
+            <w:pPr>
+              <w:pStyle w:val="ListParagraph"/>
+              <w:numPr>
+                <w:ilvl w:val="0"/>
+                <w:numId w:val="15"/>
+              </w:numPr>
+              <w:rPr>
+                <w:rFonts w:ascii="Calibri" w:hAnsi="Calibri" w:cs="Calibri"/>
+              </w:rPr>
+            </w:pPr>
+            <w:r>
+              <w:rPr>
+                <w:rFonts w:ascii="Calibri" w:hAnsi="Calibri" w:cs="Calibri"/>
+              </w:rPr>
+              <w:t>h</w:t>
+            </w:r>
+            <w:r>
+              <w:rPr>
+                <w:rFonts w:ascii="Calibri" w:hAnsi="Calibri" w:cs="Calibri"/>
+              </w:rPr>
+              <w:t>otfix</w:t>
+            </w:r>
+            <w:r>
+              <w:rPr>
+                <w:rFonts w:ascii="Calibri" w:hAnsi="Calibri" w:cs="Calibri"/>
+              </w:rPr>
+              <w:t>/workflows</w:t>
+            </w:r>
+          </w:p>
+          <w:p>
+            <w:pPr>
+              <w:pStyle w:val="ListParagraph"/>
+              <w:numPr>
+                <w:ilvl w:val="0"/>
+                <w:numId w:val="15"/>
+              </w:numPr>
+              <w:rPr>
+                <w:rFonts w:ascii="Calibri" w:hAnsi="Calibri" w:cs="Calibri"/>
+              </w:rPr>
+            </w:pPr>
+            <w:r>
+              <w:rPr>
+                <w:rFonts w:ascii="Calibri" w:hAnsi="Calibri" w:cs="Calibri"/>
+              </w:rPr>
+              <w:t>workflow/staging</w:t>
+            </w:r>
+          </w:p>
+          <w:p>
+            <w:pPr>
+              <w:pStyle w:val="ListParagraph"/>
+              <w:numPr>
+                <w:ilvl w:val="0"/>
+                <w:numId w:val="15"/>
+              </w:numPr>
+              <w:rPr>
+                <w:rFonts w:ascii="Calibri" w:hAnsi="Calibri" w:cs="Calibri"/>
+              </w:rPr>
+            </w:pPr>
+            <w:r>
+              <w:rPr>
+                <w:rFonts w:ascii="Calibri" w:hAnsi="Calibri" w:cs="Calibri"/>
+              </w:rPr>
+              <w:t>workflow/production</w:t>
+            </w:r>
+          </w:p>
+          <w:p>
+            <w:pPr>
+              <w:pStyle w:val="ListParagraph"/>
+              <w:numPr>
+                <w:ilvl w:val="0"/>
+                <w:numId w:val="15"/>
+              </w:numPr>
+              <w:rPr>
+                <w:rFonts w:ascii="Calibri" w:hAnsi="Calibri" w:cs="Calibri"/>
+              </w:rPr>
+            </w:pPr>
+            <w:r>
+              <w:rPr>
+                <w:rFonts w:ascii="Calibri" w:hAnsi="Calibri" w:cs="Calibri"/>
+              </w:rPr>
+              <w:lastRenderedPageBreak/>
+              <w:t>workflow/cd-development</w:t>
+            </w:r>
           </w:p>
         </w:tc>
       </w:tr>
@@ -1146,7 +1248,8 @@
                 <w:b/>
                 <w:bCs/>
               </w:rPr>
-              <w:t>4</w:t>
+              <w:lastRenderedPageBreak/>
+              <w:t>3</w:t>
             </w:r>
           </w:p>
         </w:tc>
@@ -1169,7 +1272,7 @@
                 <w:b/>
                 <w:bCs/>
               </w:rPr>
-              <w:t>Usama Bin Naseer</w:t>
+              <w:t>Zain Bin Imran</w:t>
             </w:r>
           </w:p>
         </w:tc>
@@ -1192,7 +1295,7 @@
                 <w:b/>
                 <w:bCs/>
               </w:rPr>
-              <w:t>L1F21BSSE0540</w:t>
+              <w:t>L1F21BSSE0539</w:t>
             </w:r>
           </w:p>
         </w:tc>
@@ -1217,6 +1320,12 @@
         <w:tc>
           <w:tcPr>
             <w:tcW w:w="2160" w:type="dxa"/>
+            <w:tcBorders>
+              <w:top w:val="single" w:sz="4" w:space="0" w:color="auto"/>
+              <w:left w:val="single" w:sz="4" w:space="0" w:color="auto"/>
+              <w:bottom w:val="single" w:sz="4" w:space="0" w:color="auto"/>
+              <w:right w:val="single" w:sz="4" w:space="0" w:color="auto"/>
+            </w:tcBorders>
           </w:tcPr>
           <w:p>
             <w:pPr>
@@ -1224,6 +1333,12 @@
                 <w:rFonts w:ascii="Calibri" w:hAnsi="Calibri" w:cs="Calibri"/>
               </w:rPr>
             </w:pPr>
+            <w:r>
+              <w:rPr>
+                <w:rFonts w:ascii="Calibri" w:hAnsi="Calibri" w:cs="Calibri"/>
+              </w:rPr>
+              <w:t>Feature/home-page</w:t>
+            </w:r>
           </w:p>
         </w:tc>
       </w:tr>
@@ -1251,7 +1366,7 @@
                 <w:b/>
                 <w:bCs/>
               </w:rPr>
-              <w:t>5</w:t>
+              <w:t>4</w:t>
             </w:r>
           </w:p>
         </w:tc>
@@ -1274,7 +1389,7 @@
                 <w:b/>
                 <w:bCs/>
               </w:rPr>
-              <w:t>Hafiz Faizan</w:t>
+              <w:t>Usama Bin Naseer</w:t>
             </w:r>
           </w:p>
         </w:tc>
@@ -1297,7 +1412,7 @@
                 <w:b/>
                 <w:bCs/>
               </w:rPr>
-              <w:t>L1F21BSSE0030</w:t>
+              <w:t>L1F21BSSE0540</w:t>
             </w:r>
           </w:p>
         </w:tc>
@@ -1322,6 +1437,12 @@
         <w:tc>
           <w:tcPr>
             <w:tcW w:w="2160" w:type="dxa"/>
+            <w:tcBorders>
+              <w:top w:val="single" w:sz="4" w:space="0" w:color="auto"/>
+              <w:left w:val="single" w:sz="4" w:space="0" w:color="auto"/>
+              <w:bottom w:val="single" w:sz="4" w:space="0" w:color="auto"/>
+              <w:right w:val="single" w:sz="4" w:space="0" w:color="auto"/>
+            </w:tcBorders>
           </w:tcPr>
           <w:p>
             <w:pPr>
@@ -1329,6 +1450,12 @@
                 <w:rFonts w:ascii="Calibri" w:hAnsi="Calibri" w:cs="Calibri"/>
               </w:rPr>
             </w:pPr>
+            <w:r>
+              <w:rPr>
+                <w:rFonts w:ascii="Calibri" w:hAnsi="Calibri" w:cs="Calibri"/>
+              </w:rPr>
+              <w:t>Feature/services</w:t>
+            </w:r>
           </w:p>
         </w:tc>
       </w:tr>
@@ -1356,7 +1483,7 @@
                 <w:b/>
                 <w:bCs/>
               </w:rPr>
-              <w:t>6</w:t>
+              <w:t>5</w:t>
             </w:r>
           </w:p>
         </w:tc>
@@ -1379,8 +1506,18 @@
                 <w:b/>
                 <w:bCs/>
               </w:rPr>
-              <w:t>Ali Hassan</w:t>
-            </w:r>
+              <w:t xml:space="preserve">Hafiz </w:t>
+            </w:r>
+            <w:proofErr w:type="spellStart"/>
+            <w:r>
+              <w:rPr>
+                <w:rFonts w:ascii="Calibri" w:hAnsi="Calibri" w:cs="Calibri"/>
+                <w:b/>
+                <w:bCs/>
+              </w:rPr>
+              <w:t>Faizan</w:t>
+            </w:r>
+            <w:proofErr w:type="spellEnd"/>
           </w:p>
         </w:tc>
         <w:tc>
@@ -1402,7 +1539,7 @@
                 <w:b/>
                 <w:bCs/>
               </w:rPr>
-              <w:t>L1F21BSSE0205</w:t>
+              <w:t>L1F21BSSE0030</w:t>
             </w:r>
           </w:p>
         </w:tc>
@@ -1427,6 +1564,12 @@
         <w:tc>
           <w:tcPr>
             <w:tcW w:w="2160" w:type="dxa"/>
+            <w:tcBorders>
+              <w:top w:val="single" w:sz="4" w:space="0" w:color="auto"/>
+              <w:left w:val="single" w:sz="4" w:space="0" w:color="auto"/>
+              <w:bottom w:val="single" w:sz="4" w:space="0" w:color="auto"/>
+              <w:right w:val="single" w:sz="4" w:space="0" w:color="auto"/>
+            </w:tcBorders>
           </w:tcPr>
           <w:p>
             <w:pPr>
@@ -1434,6 +1577,129 @@
                 <w:rFonts w:ascii="Calibri" w:hAnsi="Calibri" w:cs="Calibri"/>
               </w:rPr>
             </w:pPr>
+            <w:r>
+              <w:rPr>
+                <w:rFonts w:ascii="Calibri" w:hAnsi="Calibri" w:cs="Calibri"/>
+              </w:rPr>
+              <w:t>Feature/portfolio</w:t>
+            </w:r>
+          </w:p>
+        </w:tc>
+      </w:tr>
+      <w:tr>
+        <w:trPr>
+          <w:trHeight w:val="458"/>
+        </w:trPr>
+        <w:tc>
+          <w:tcPr>
+            <w:tcW w:w="625" w:type="dxa"/>
+            <w:vAlign w:val="center"/>
+          </w:tcPr>
+          <w:p>
+            <w:pPr>
+              <w:jc w:val="center"/>
+              <w:rPr>
+                <w:rFonts w:ascii="Calibri" w:hAnsi="Calibri" w:cs="Calibri"/>
+                <w:b/>
+                <w:bCs/>
+              </w:rPr>
+            </w:pPr>
+            <w:r>
+              <w:rPr>
+                <w:rFonts w:ascii="Calibri" w:hAnsi="Calibri" w:cs="Calibri"/>
+                <w:b/>
+                <w:bCs/>
+              </w:rPr>
+              <w:t>6</w:t>
+            </w:r>
+          </w:p>
+        </w:tc>
+        <w:tc>
+          <w:tcPr>
+            <w:tcW w:w="2520" w:type="dxa"/>
+            <w:vAlign w:val="center"/>
+          </w:tcPr>
+          <w:p>
+            <w:pPr>
+              <w:rPr>
+                <w:rFonts w:ascii="Calibri" w:hAnsi="Calibri" w:cs="Calibri"/>
+                <w:b/>
+                <w:bCs/>
+              </w:rPr>
+            </w:pPr>
+            <w:r>
+              <w:rPr>
+                <w:rFonts w:ascii="Calibri" w:hAnsi="Calibri" w:cs="Calibri"/>
+                <w:b/>
+                <w:bCs/>
+              </w:rPr>
+              <w:t>Ali Hassan</w:t>
+            </w:r>
+          </w:p>
+        </w:tc>
+        <w:tc>
+          <w:tcPr>
+            <w:tcW w:w="2520" w:type="dxa"/>
+            <w:vAlign w:val="center"/>
+          </w:tcPr>
+          <w:p>
+            <w:pPr>
+              <w:rPr>
+                <w:rFonts w:ascii="Calibri" w:hAnsi="Calibri" w:cs="Calibri"/>
+                <w:b/>
+                <w:bCs/>
+              </w:rPr>
+            </w:pPr>
+            <w:r>
+              <w:rPr>
+                <w:rFonts w:ascii="Calibri" w:hAnsi="Calibri" w:cs="Calibri"/>
+                <w:b/>
+                <w:bCs/>
+              </w:rPr>
+              <w:t>L1F21BSSE0205</w:t>
+            </w:r>
+          </w:p>
+        </w:tc>
+        <w:tc>
+          <w:tcPr>
+            <w:tcW w:w="1620" w:type="dxa"/>
+          </w:tcPr>
+          <w:p>
+            <w:pPr>
+              <w:rPr>
+                <w:rFonts w:ascii="Calibri" w:hAnsi="Calibri" w:cs="Calibri"/>
+              </w:rPr>
+            </w:pPr>
+            <w:r>
+              <w:rPr>
+                <w:rFonts w:ascii="Calibri" w:hAnsi="Calibri" w:cs="Calibri"/>
+              </w:rPr>
+              <w:t>Team Member</w:t>
+            </w:r>
+          </w:p>
+        </w:tc>
+        <w:tc>
+          <w:tcPr>
+            <w:tcW w:w="2160" w:type="dxa"/>
+            <w:tcBorders>
+              <w:top w:val="single" w:sz="4" w:space="0" w:color="auto"/>
+              <w:left w:val="single" w:sz="4" w:space="0" w:color="auto"/>
+              <w:bottom w:val="single" w:sz="4" w:space="0" w:color="auto"/>
+              <w:right w:val="single" w:sz="4" w:space="0" w:color="auto"/>
+            </w:tcBorders>
+          </w:tcPr>
+          <w:p>
+            <w:pPr>
+              <w:rPr>
+                <w:rFonts w:ascii="Calibri" w:hAnsi="Calibri" w:cs="Calibri"/>
+              </w:rPr>
+            </w:pPr>
+            <w:r>
+              <w:rPr>
+                <w:rFonts w:ascii="Calibri" w:hAnsi="Calibri" w:cs="Calibri"/>
+              </w:rPr>
+              <w:t>Feature/about-us</w:t>
+            </w:r>
           </w:p>
         </w:tc>
       </w:tr>
@@ -1466,7 +1732,6 @@
           <w:sz w:val="30"/>
           <w:szCs w:val="30"/>
         </w:rPr>
-        <w:lastRenderedPageBreak/>
         <w:t>Scenario</w:t>
       </w:r>
     </w:p>
@@ -1765,6 +2030,7 @@
           <w:sz w:val="30"/>
           <w:szCs w:val="30"/>
         </w:rPr>
+        <w:lastRenderedPageBreak/>
         <w:t>Evaluation Criteria</w:t>
       </w:r>
     </w:p>
@@ -2374,7 +2640,7 @@
         </w:rPr>
         <w:t xml:space="preserve">: </w:t>
       </w:r>
-      <w:hyperlink r:id="rId7" w:history="1">
+      <w:hyperlink r:id="rId9" w:history="1">
         <w:r>
           <w:rPr>
             <w:rStyle w:val="Hyperlink"/>
@@ -2592,8 +2858,17 @@
           <w:sz w:val="24"/>
           <w:szCs w:val="24"/>
         </w:rPr>
-        <w:t xml:space="preserve"> for each environemtn</w:t>
-      </w:r>
+        <w:t xml:space="preserve"> for each </w:t>
+      </w:r>
+      <w:proofErr w:type="spellStart"/>
+      <w:r>
+        <w:rPr>
+          <w:sz w:val="24"/>
+          <w:szCs w:val="24"/>
+        </w:rPr>
+        <w:t>environemtn</w:t>
+      </w:r>
+      <w:proofErr w:type="spellEnd"/>
       <w:r>
         <w:rPr>
           <w:sz w:val="24"/>
@@ -2636,16 +2911,30 @@
         <w:keepNext/>
       </w:pPr>
       <w:r>
+        <w:lastRenderedPageBreak/>
         <w:t xml:space="preserve">Table </w:t>
       </w:r>
-      <w:fldSimple w:instr=" SEQ Table \* ARABIC ">
-        <w:r>
-          <w:rPr>
-            <w:noProof/>
-          </w:rPr>
-          <w:t>2</w:t>
-        </w:r>
-      </w:fldSimple>
+      <w:r>
+        <w:fldChar w:fldCharType="begin"/>
+      </w:r>
+      <w:r>
+        <w:instrText xml:space="preserve"> SEQ Table \* ARABIC </w:instrText>
+      </w:r>
+      <w:r>
+        <w:fldChar w:fldCharType="separate"/>
+      </w:r>
+      <w:r>
+        <w:rPr>
+          <w:noProof/>
+        </w:rPr>
+        <w:t>2</w:t>
+      </w:r>
+      <w:r>
+        <w:rPr>
+          <w:noProof/>
+        </w:rPr>
+        <w:fldChar w:fldCharType="end"/>
+      </w:r>
     </w:p>
     <w:tbl>
       <w:tblPr>
@@ -3662,6 +3951,7 @@
         <w:br/>
         <w:t>5.2. Develop the HTML and CSS files for the assigned page, adhering to linting rules (</w:t>
       </w:r>
+      <w:proofErr w:type="spellStart"/>
       <w:r>
         <w:rPr>
           <w:b/>
@@ -3671,6 +3961,7 @@
         </w:rPr>
         <w:t>HTMLHint</w:t>
       </w:r>
+      <w:proofErr w:type="spellEnd"/>
       <w:r>
         <w:rPr>
           <w:sz w:val="24"/>
@@ -3678,6 +3969,7 @@
         </w:rPr>
         <w:t xml:space="preserve"> and </w:t>
       </w:r>
+      <w:proofErr w:type="spellStart"/>
       <w:r>
         <w:rPr>
           <w:b/>
@@ -3687,6 +3979,7 @@
         </w:rPr>
         <w:t>Stylelint</w:t>
       </w:r>
+      <w:proofErr w:type="spellEnd"/>
       <w:r>
         <w:rPr>
           <w:sz w:val="24"/>
@@ -3789,6 +4082,13 @@
           <w:szCs w:val="24"/>
         </w:rPr>
         <w:br/>
+      </w:r>
+      <w:r>
+        <w:rPr>
+          <w:sz w:val="24"/>
+          <w:szCs w:val="24"/>
+        </w:rPr>
+        <w:lastRenderedPageBreak/>
         <w:t>5.4. Resolve any issues identified by the PR validation workflow and ensure all checks pass.</w:t>
       </w:r>
       <w:r>
@@ -3875,7 +4175,7 @@
       </w:r>
     </w:p>
     <w:sectPr>
-      <w:headerReference w:type="default" r:id="rId8"/>
+      <w:headerReference w:type="default" r:id="rId10"/>
       <w:pgSz w:w="12240" w:h="15840"/>
       <w:pgMar w:top="1440" w:right="1440" w:bottom="1440" w:left="1440" w:header="720" w:footer="720" w:gutter="0"/>
       <w:cols w:space="720"/>
@@ -3886,7 +4186,7 @@
 </file>
 
 <file path=word/endnotes.xml><?xml version="1.0" encoding="utf-8"?>
-<w:endnotes xmlns:wpc="http://schemas.microsoft.com/office/word/2010/wordprocessingCanvas" xmlns:cx="http://schemas.microsoft.com/office/drawing/2014/chartex" xmlns:cx1="http://schemas.microsoft.com/office/drawing/2015/9/8/chartex" xmlns:cx2="http://schemas.microsoft.com/office/drawing/2015/10/21/chartex" xmlns:cx3="http://schemas.microsoft.com/office/drawing/2016/5/9/chartex" xmlns:cx4="http://schemas.microsoft.com/office/drawing/2016/5/10/chartex" xmlns:cx5="http://schemas.microsoft.com/office/drawing/2016/5/11/chartex" xmlns:cx6="http://schemas.microsoft.com/office/drawing/2016/5/12/chartex" xmlns:cx7="http://schemas.microsoft.com/office/drawing/2016/5/13/chartex" xmlns:cx8="http://schemas.microsoft.com/office/drawing/2016/5/14/chartex" xmlns:mc="http://schemas.openxmlformats.org/markup-compatibility/2006" xmlns:aink="http://schemas.microsoft.com/office/drawing/2016/ink" xmlns:am3d="http://schemas.microsoft.com/office/drawing/2017/model3d" xmlns:o="urn:schemas-microsoft-com:office:office" xmlns:oel="http://schemas.microsoft.com/office/2019/extlst" xmlns:r="http://schemas.openxmlformats.org/officeDocument/2006/relationships" xmlns:m="http://schemas.openxmlformats.org/officeDocument/2006/math" xmlns:v="urn:schemas-microsoft-com:vml" xmlns:wp14="http://schemas.microsoft.com/office/word/2010/wordprocessingDrawing" xmlns:wp="http://schemas.openxmlformats.org/drawingml/2006/wordprocessingDrawing" xmlns:w10="urn:schemas-microsoft-com:office:word" xmlns:w="http://schemas.openxmlformats.org/wordprocessingml/2006/main" xmlns:w14="http://schemas.microsoft.com/office/word/2010/wordml" xmlns:w15="http://schemas.microsoft.com/office/word/2012/wordml" xmlns:w16cex="http://schemas.microsoft.com/office/word/2018/wordml/cex" xmlns:w16cid="http://schemas.microsoft.com/office/word/2016/wordml/cid" xmlns:w16="http://schemas.microsoft.com/office/word/2018/wordml" xmlns:w16du="http://schemas.microsoft.com/office/word/2023/wordml/word16du" xmlns:w16sdtdh="http://schemas.microsoft.com/office/word/2020/wordml/sdtdatahash" xmlns:w16sdtfl="http://schemas.microsoft.com/office/word/2024/wordml/sdtformatlock" xmlns:w16se="http://schemas.microsoft.com/office/word/2015/wordml/symex" xmlns:wpg="http://schemas.microsoft.com/office/word/2010/wordprocessingGroup" xmlns:wpi="http://schemas.microsoft.com/office/word/2010/wordprocessingInk" xmlns:wne="http://schemas.microsoft.com/office/word/2006/wordml" xmlns:wps="http://schemas.microsoft.com/office/word/2010/wordprocessingShape" mc:Ignorable="w14 w15 w16se w16cid w16 w16cex w16sdtdh w16sdtfl w16du wp14">
+<w:endnotes xmlns:wpc="http://schemas.microsoft.com/office/word/2010/wordprocessingCanvas" xmlns:cx="http://schemas.microsoft.com/office/drawing/2014/chartex" xmlns:cx1="http://schemas.microsoft.com/office/drawing/2015/9/8/chartex" xmlns:cx2="http://schemas.microsoft.com/office/drawing/2015/10/21/chartex" xmlns:cx3="http://schemas.microsoft.com/office/drawing/2016/5/9/chartex" xmlns:cx4="http://schemas.microsoft.com/office/drawing/2016/5/10/chartex" xmlns:cx5="http://schemas.microsoft.com/office/drawing/2016/5/11/chartex" xmlns:cx6="http://schemas.microsoft.com/office/drawing/2016/5/12/chartex" xmlns:cx7="http://schemas.microsoft.com/office/drawing/2016/5/13/chartex" xmlns:cx8="http://schemas.microsoft.com/office/drawing/2016/5/14/chartex" xmlns:mc="http://schemas.openxmlformats.org/markup-compatibility/2006" xmlns:aink="http://schemas.microsoft.com/office/drawing/2016/ink" xmlns:am3d="http://schemas.microsoft.com/office/drawing/2017/model3d" xmlns:o="urn:schemas-microsoft-com:office:office" xmlns:r="http://schemas.openxmlformats.org/officeDocument/2006/relationships" xmlns:m="http://schemas.openxmlformats.org/officeDocument/2006/math" xmlns:v="urn:schemas-microsoft-com:vml" xmlns:wp14="http://schemas.microsoft.com/office/word/2010/wordprocessingDrawing" xmlns:wp="http://schemas.openxmlformats.org/drawingml/2006/wordprocessingDrawing" xmlns:w10="urn:schemas-microsoft-com:office:word" xmlns:w="http://schemas.openxmlformats.org/wordprocessingml/2006/main" xmlns:w14="http://schemas.microsoft.com/office/word/2010/wordml" xmlns:w15="http://schemas.microsoft.com/office/word/2012/wordml" xmlns:w16cex="http://schemas.microsoft.com/office/word/2018/wordml/cex" xmlns:w16cid="http://schemas.microsoft.com/office/word/2016/wordml/cid" xmlns:w16="http://schemas.microsoft.com/office/word/2018/wordml" xmlns:w16sdtdh="http://schemas.microsoft.com/office/word/2020/wordml/sdtdatahash" xmlns:w16se="http://schemas.microsoft.com/office/word/2015/wordml/symex" xmlns:wpg="http://schemas.microsoft.com/office/word/2010/wordprocessingGroup" xmlns:wpi="http://schemas.microsoft.com/office/word/2010/wordprocessingInk" xmlns:wne="http://schemas.microsoft.com/office/word/2006/wordml" xmlns:wps="http://schemas.microsoft.com/office/word/2010/wordprocessingShape" mc:Ignorable="w14 w15 w16se w16cid w16 w16cex w16sdtdh wp14">
   <w:endnote w:type="separator" w:id="-1">
     <w:p>
       <w:pPr>
@@ -3911,7 +4211,7 @@
 </file>
 
 <file path=word/footnotes.xml><?xml version="1.0" encoding="utf-8"?>
-<w:footnotes xmlns:wpc="http://schemas.microsoft.com/office/word/2010/wordprocessingCanvas" xmlns:cx="http://schemas.microsoft.com/office/drawing/2014/chartex" xmlns:cx1="http://schemas.microsoft.com/office/drawing/2015/9/8/chartex" xmlns:cx2="http://schemas.microsoft.com/office/drawing/2015/10/21/chartex" xmlns:cx3="http://schemas.microsoft.com/office/drawing/2016/5/9/chartex" xmlns:cx4="http://schemas.microsoft.com/office/drawing/2016/5/10/chartex" xmlns:cx5="http://schemas.microsoft.com/office/drawing/2016/5/11/chartex" xmlns:cx6="http://schemas.microsoft.com/office/drawing/2016/5/12/chartex" xmlns:cx7="http://schemas.microsoft.com/office/drawing/2016/5/13/chartex" xmlns:cx8="http://schemas.microsoft.com/office/drawing/2016/5/14/chartex" xmlns:mc="http://schemas.openxmlformats.org/markup-compatibility/2006" xmlns:aink="http://schemas.microsoft.com/office/drawing/2016/ink" xmlns:am3d="http://schemas.microsoft.com/office/drawing/2017/model3d" xmlns:o="urn:schemas-microsoft-com:office:office" xmlns:oel="http://schemas.microsoft.com/office/2019/extlst" xmlns:r="http://schemas.openxmlformats.org/officeDocument/2006/relationships" xmlns:m="http://schemas.openxmlformats.org/officeDocument/2006/math" xmlns:v="urn:schemas-microsoft-com:vml" xmlns:wp14="http://schemas.microsoft.com/office/word/2010/wordprocessingDrawing" xmlns:wp="http://schemas.openxmlformats.org/drawingml/2006/wordprocessingDrawing" xmlns:w10="urn:schemas-microsoft-com:office:word" xmlns:w="http://schemas.openxmlformats.org/wordprocessingml/2006/main" xmlns:w14="http://schemas.microsoft.com/office/word/2010/wordml" xmlns:w15="http://schemas.microsoft.com/office/word/2012/wordml" xmlns:w16cex="http://schemas.microsoft.com/office/word/2018/wordml/cex" xmlns:w16cid="http://schemas.microsoft.com/office/word/2016/wordml/cid" xmlns:w16="http://schemas.microsoft.com/office/word/2018/wordml" xmlns:w16du="http://schemas.microsoft.com/office/word/2023/wordml/word16du" xmlns:w16sdtdh="http://schemas.microsoft.com/office/word/2020/wordml/sdtdatahash" xmlns:w16sdtfl="http://schemas.microsoft.com/office/word/2024/wordml/sdtformatlock" xmlns:w16se="http://schemas.microsoft.com/office/word/2015/wordml/symex" xmlns:wpg="http://schemas.microsoft.com/office/word/2010/wordprocessingGroup" xmlns:wpi="http://schemas.microsoft.com/office/word/2010/wordprocessingInk" xmlns:wne="http://schemas.microsoft.com/office/word/2006/wordml" xmlns:wps="http://schemas.microsoft.com/office/word/2010/wordprocessingShape" mc:Ignorable="w14 w15 w16se w16cid w16 w16cex w16sdtdh w16sdtfl w16du wp14">
+<w:footnotes xmlns:wpc="http://schemas.microsoft.com/office/word/2010/wordprocessingCanvas" xmlns:cx="http://schemas.microsoft.com/office/drawing/2014/chartex" xmlns:cx1="http://schemas.microsoft.com/office/drawing/2015/9/8/chartex" xmlns:cx2="http://schemas.microsoft.com/office/drawing/2015/10/21/chartex" xmlns:cx3="http://schemas.microsoft.com/office/drawing/2016/5/9/chartex" xmlns:cx4="http://schemas.microsoft.com/office/drawing/2016/5/10/chartex" xmlns:cx5="http://schemas.microsoft.com/office/drawing/2016/5/11/chartex" xmlns:cx6="http://schemas.microsoft.com/office/drawing/2016/5/12/chartex" xmlns:cx7="http://schemas.microsoft.com/office/drawing/2016/5/13/chartex" xmlns:cx8="http://schemas.microsoft.com/office/drawing/2016/5/14/chartex" xmlns:mc="http://schemas.openxmlformats.org/markup-compatibility/2006" xmlns:aink="http://schemas.microsoft.com/office/drawing/2016/ink" xmlns:am3d="http://schemas.microsoft.com/office/drawing/2017/model3d" xmlns:o="urn:schemas-microsoft-com:office:office" xmlns:r="http://schemas.openxmlformats.org/officeDocument/2006/relationships" xmlns:m="http://schemas.openxmlformats.org/officeDocument/2006/math" xmlns:v="urn:schemas-microsoft-com:vml" xmlns:wp14="http://schemas.microsoft.com/office/word/2010/wordprocessingDrawing" xmlns:wp="http://schemas.openxmlformats.org/drawingml/2006/wordprocessingDrawing" xmlns:w10="urn:schemas-microsoft-com:office:word" xmlns:w="http://schemas.openxmlformats.org/wordprocessingml/2006/main" xmlns:w14="http://schemas.microsoft.com/office/word/2010/wordml" xmlns:w15="http://schemas.microsoft.com/office/word/2012/wordml" xmlns:w16cex="http://schemas.microsoft.com/office/word/2018/wordml/cex" xmlns:w16cid="http://schemas.microsoft.com/office/word/2016/wordml/cid" xmlns:w16="http://schemas.microsoft.com/office/word/2018/wordml" xmlns:w16sdtdh="http://schemas.microsoft.com/office/word/2020/wordml/sdtdatahash" xmlns:w16se="http://schemas.microsoft.com/office/word/2015/wordml/symex" xmlns:wpg="http://schemas.microsoft.com/office/word/2010/wordprocessingGroup" xmlns:wpi="http://schemas.microsoft.com/office/word/2010/wordprocessingInk" xmlns:wne="http://schemas.microsoft.com/office/word/2006/wordml" xmlns:wps="http://schemas.microsoft.com/office/word/2010/wordprocessingShape" mc:Ignorable="w14 w15 w16se w16cid w16 w16cex w16sdtdh wp14">
   <w:footnote w:type="separator" w:id="-1">
     <w:p>
       <w:pPr>
@@ -3936,7 +4236,7 @@
 </file>
 
 <file path=word/header1.xml><?xml version="1.0" encoding="utf-8"?>
-<w:hdr xmlns:wpc="http://schemas.microsoft.com/office/word/2010/wordprocessingCanvas" xmlns:cx="http://schemas.microsoft.com/office/drawing/2014/chartex" xmlns:cx1="http://schemas.microsoft.com/office/drawing/2015/9/8/chartex" xmlns:cx2="http://schemas.microsoft.com/office/drawing/2015/10/21/chartex" xmlns:cx3="http://schemas.microsoft.com/office/drawing/2016/5/9/chartex" xmlns:cx4="http://schemas.microsoft.com/office/drawing/2016/5/10/chartex" xmlns:cx5="http://schemas.microsoft.com/office/drawing/2016/5/11/chartex" xmlns:cx6="http://schemas.microsoft.com/office/drawing/2016/5/12/chartex" xmlns:cx7="http://schemas.microsoft.com/office/drawing/2016/5/13/chartex" xmlns:cx8="http://schemas.microsoft.com/office/drawing/2016/5/14/chartex" xmlns:mc="http://schemas.openxmlformats.org/markup-compatibility/2006" xmlns:aink="http://schemas.microsoft.com/office/drawing/2016/ink" xmlns:am3d="http://schemas.microsoft.com/office/drawing/2017/model3d" xmlns:o="urn:schemas-microsoft-com:office:office" xmlns:oel="http://schemas.microsoft.com/office/2019/extlst" xmlns:r="http://schemas.openxmlformats.org/officeDocument/2006/relationships" xmlns:m="http://schemas.openxmlformats.org/officeDocument/2006/math" xmlns:v="urn:schemas-microsoft-com:vml" xmlns:wp14="http://schemas.microsoft.com/office/word/2010/wordprocessingDrawing" xmlns:wp="http://schemas.openxmlformats.org/drawingml/2006/wordprocessingDrawing" xmlns:w10="urn:schemas-microsoft-com:office:word" xmlns:w="http://schemas.openxmlformats.org/wordprocessingml/2006/main" xmlns:w14="http://schemas.microsoft.com/office/word/2010/wordml" xmlns:w15="http://schemas.microsoft.com/office/word/2012/wordml" xmlns:w16cex="http://schemas.microsoft.com/office/word/2018/wordml/cex" xmlns:w16cid="http://schemas.microsoft.com/office/word/2016/wordml/cid" xmlns:w16="http://schemas.microsoft.com/office/word/2018/wordml" xmlns:w16du="http://schemas.microsoft.com/office/word/2023/wordml/word16du" xmlns:w16sdtdh="http://schemas.microsoft.com/office/word/2020/wordml/sdtdatahash" xmlns:w16sdtfl="http://schemas.microsoft.com/office/word/2024/wordml/sdtformatlock" xmlns:w16se="http://schemas.microsoft.com/office/word/2015/wordml/symex" xmlns:wpg="http://schemas.microsoft.com/office/word/2010/wordprocessingGroup" xmlns:wpi="http://schemas.microsoft.com/office/word/2010/wordprocessingInk" xmlns:wne="http://schemas.microsoft.com/office/word/2006/wordml" xmlns:wps="http://schemas.microsoft.com/office/word/2010/wordprocessingShape" mc:Ignorable="w14 w15 w16se w16cid w16 w16cex w16sdtdh w16sdtfl w16du wp14">
+<w:hdr xmlns:wpc="http://schemas.microsoft.com/office/word/2010/wordprocessingCanvas" xmlns:cx="http://schemas.microsoft.com/office/drawing/2014/chartex" xmlns:cx1="http://schemas.microsoft.com/office/drawing/2015/9/8/chartex" xmlns:cx2="http://schemas.microsoft.com/office/drawing/2015/10/21/chartex" xmlns:cx3="http://schemas.microsoft.com/office/drawing/2016/5/9/chartex" xmlns:cx4="http://schemas.microsoft.com/office/drawing/2016/5/10/chartex" xmlns:cx5="http://schemas.microsoft.com/office/drawing/2016/5/11/chartex" xmlns:cx6="http://schemas.microsoft.com/office/drawing/2016/5/12/chartex" xmlns:cx7="http://schemas.microsoft.com/office/drawing/2016/5/13/chartex" xmlns:cx8="http://schemas.microsoft.com/office/drawing/2016/5/14/chartex" xmlns:mc="http://schemas.openxmlformats.org/markup-compatibility/2006" xmlns:aink="http://schemas.microsoft.com/office/drawing/2016/ink" xmlns:am3d="http://schemas.microsoft.com/office/drawing/2017/model3d" xmlns:o="urn:schemas-microsoft-com:office:office" xmlns:r="http://schemas.openxmlformats.org/officeDocument/2006/relationships" xmlns:m="http://schemas.openxmlformats.org/officeDocument/2006/math" xmlns:v="urn:schemas-microsoft-com:vml" xmlns:wp14="http://schemas.microsoft.com/office/word/2010/wordprocessingDrawing" xmlns:wp="http://schemas.openxmlformats.org/drawingml/2006/wordprocessingDrawing" xmlns:w10="urn:schemas-microsoft-com:office:word" xmlns:w="http://schemas.openxmlformats.org/wordprocessingml/2006/main" xmlns:w14="http://schemas.microsoft.com/office/word/2010/wordml" xmlns:w15="http://schemas.microsoft.com/office/word/2012/wordml" xmlns:w16cex="http://schemas.microsoft.com/office/word/2018/wordml/cex" xmlns:w16cid="http://schemas.microsoft.com/office/word/2016/wordml/cid" xmlns:w16="http://schemas.microsoft.com/office/word/2018/wordml" xmlns:w16sdtdh="http://schemas.microsoft.com/office/word/2020/wordml/sdtdatahash" xmlns:w16se="http://schemas.microsoft.com/office/word/2015/wordml/symex" xmlns:wpg="http://schemas.microsoft.com/office/word/2010/wordprocessingGroup" xmlns:wpi="http://schemas.microsoft.com/office/word/2010/wordprocessingInk" xmlns:wne="http://schemas.microsoft.com/office/word/2006/wordml" xmlns:wps="http://schemas.microsoft.com/office/word/2010/wordprocessingShape" mc:Ignorable="w14 w15 w16se w16cid w16 w16cex w16sdtdh wp14">
   <w:p>
     <w:pPr>
       <w:spacing w:after="0" w:line="240" w:lineRule="auto"/>
@@ -4079,7 +4379,7 @@
 </file>
 
 <file path=word/numbering.xml><?xml version="1.0" encoding="utf-8"?>
-<w:numbering xmlns:wpc="http://schemas.microsoft.com/office/word/2010/wordprocessingCanvas" xmlns:cx="http://schemas.microsoft.com/office/drawing/2014/chartex" xmlns:cx1="http://schemas.microsoft.com/office/drawing/2015/9/8/chartex" xmlns:cx2="http://schemas.microsoft.com/office/drawing/2015/10/21/chartex" xmlns:cx3="http://schemas.microsoft.com/office/drawing/2016/5/9/chartex" xmlns:cx4="http://schemas.microsoft.com/office/drawing/2016/5/10/chartex" xmlns:cx5="http://schemas.microsoft.com/office/drawing/2016/5/11/chartex" xmlns:cx6="http://schemas.microsoft.com/office/drawing/2016/5/12/chartex" xmlns:cx7="http://schemas.microsoft.com/office/drawing/2016/5/13/chartex" xmlns:cx8="http://schemas.microsoft.com/office/drawing/2016/5/14/chartex" xmlns:mc="http://schemas.openxmlformats.org/markup-compatibility/2006" xmlns:aink="http://schemas.microsoft.com/office/drawing/2016/ink" xmlns:am3d="http://schemas.microsoft.com/office/drawing/2017/model3d" xmlns:o="urn:schemas-microsoft-com:office:office" xmlns:oel="http://schemas.microsoft.com/office/2019/extlst" xmlns:r="http://schemas.openxmlformats.org/officeDocument/2006/relationships" xmlns:m="http://schemas.openxmlformats.org/officeDocument/2006/math" xmlns:v="urn:schemas-microsoft-com:vml" xmlns:wp14="http://schemas.microsoft.com/office/word/2010/wordprocessingDrawing" xmlns:wp="http://schemas.openxmlformats.org/drawingml/2006/wordprocessingDrawing" xmlns:w10="urn:schemas-microsoft-com:office:word" xmlns:w="http://schemas.openxmlformats.org/wordprocessingml/2006/main" xmlns:w14="http://schemas.microsoft.com/office/word/2010/wordml" xmlns:w15="http://schemas.microsoft.com/office/word/2012/wordml" xmlns:w16cex="http://schemas.microsoft.com/office/word/2018/wordml/cex" xmlns:w16cid="http://schemas.microsoft.com/office/word/2016/wordml/cid" xmlns:w16="http://schemas.microsoft.com/office/word/2018/wordml" xmlns:w16du="http://schemas.microsoft.com/office/word/2023/wordml/word16du" xmlns:w16sdtdh="http://schemas.microsoft.com/office/word/2020/wordml/sdtdatahash" xmlns:w16sdtfl="http://schemas.microsoft.com/office/word/2024/wordml/sdtformatlock" xmlns:w16se="http://schemas.microsoft.com/office/word/2015/wordml/symex" xmlns:wpg="http://schemas.microsoft.com/office/word/2010/wordprocessingGroup" xmlns:wpi="http://schemas.microsoft.com/office/word/2010/wordprocessingInk" xmlns:wne="http://schemas.microsoft.com/office/word/2006/wordml" xmlns:wps="http://schemas.microsoft.com/office/word/2010/wordprocessingShape" mc:Ignorable="w14 w15 w16se w16cid w16 w16cex w16sdtdh w16sdtfl w16du wp14">
+<w:numbering xmlns:wpc="http://schemas.microsoft.com/office/word/2010/wordprocessingCanvas" xmlns:cx="http://schemas.microsoft.com/office/drawing/2014/chartex" xmlns:cx1="http://schemas.microsoft.com/office/drawing/2015/9/8/chartex" xmlns:cx2="http://schemas.microsoft.com/office/drawing/2015/10/21/chartex" xmlns:cx3="http://schemas.microsoft.com/office/drawing/2016/5/9/chartex" xmlns:cx4="http://schemas.microsoft.com/office/drawing/2016/5/10/chartex" xmlns:cx5="http://schemas.microsoft.com/office/drawing/2016/5/11/chartex" xmlns:cx6="http://schemas.microsoft.com/office/drawing/2016/5/12/chartex" xmlns:cx7="http://schemas.microsoft.com/office/drawing/2016/5/13/chartex" xmlns:cx8="http://schemas.microsoft.com/office/drawing/2016/5/14/chartex" xmlns:mc="http://schemas.openxmlformats.org/markup-compatibility/2006" xmlns:aink="http://schemas.microsoft.com/office/drawing/2016/ink" xmlns:am3d="http://schemas.microsoft.com/office/drawing/2017/model3d" xmlns:o="urn:schemas-microsoft-com:office:office" xmlns:r="http://schemas.openxmlformats.org/officeDocument/2006/relationships" xmlns:m="http://schemas.openxmlformats.org/officeDocument/2006/math" xmlns:v="urn:schemas-microsoft-com:vml" xmlns:wp14="http://schemas.microsoft.com/office/word/2010/wordprocessingDrawing" xmlns:wp="http://schemas.openxmlformats.org/drawingml/2006/wordprocessingDrawing" xmlns:w10="urn:schemas-microsoft-com:office:word" xmlns:w="http://schemas.openxmlformats.org/wordprocessingml/2006/main" xmlns:w14="http://schemas.microsoft.com/office/word/2010/wordml" xmlns:w15="http://schemas.microsoft.com/office/word/2012/wordml" xmlns:w16cex="http://schemas.microsoft.com/office/word/2018/wordml/cex" xmlns:w16cid="http://schemas.microsoft.com/office/word/2016/wordml/cid" xmlns:w16="http://schemas.microsoft.com/office/word/2018/wordml" xmlns:w16sdtdh="http://schemas.microsoft.com/office/word/2020/wordml/sdtdatahash" xmlns:w16se="http://schemas.microsoft.com/office/word/2015/wordml/symex" xmlns:wpg="http://schemas.microsoft.com/office/word/2010/wordprocessingGroup" xmlns:wpi="http://schemas.microsoft.com/office/word/2010/wordprocessingInk" xmlns:wne="http://schemas.microsoft.com/office/word/2006/wordml" xmlns:wps="http://schemas.microsoft.com/office/word/2010/wordprocessingShape" mc:Ignorable="w14 w15 w16se w16cid w16 w16cex w16sdtdh wp14">
   <w:abstractNum w:abstractNumId="0" w15:restartNumberingAfterBreak="0">
     <w:nsid w:val="0FF85A8C"/>
     <w:multiLevelType w:val="hybridMultilevel"/>
@@ -5660,6 +5960,92 @@
     </w:lvl>
   </w:abstractNum>
   <w:abstractNum w:abstractNumId="13" w15:restartNumberingAfterBreak="0">
+    <w:nsid w:val="732F27E1"/>
+    <w:multiLevelType w:val="hybridMultilevel"/>
+    <w:tmpl w:val="5150BC0E"/>
+    <w:lvl w:ilvl="0" w:tplc="0409000F">
+      <w:start w:val="1"/>
+      <w:numFmt w:val="decimal"/>
+      <w:lvlText w:val="%1."/>
+      <w:lvlJc w:val="left"/>
+      <w:pPr>
+        <w:ind w:left="720" w:hanging="360"/>
+      </w:pPr>
+    </w:lvl>
+    <w:lvl w:ilvl="1" w:tplc="04090019" w:tentative="1">
+      <w:start w:val="1"/>
+      <w:numFmt w:val="lowerLetter"/>
+      <w:lvlText w:val="%2."/>
+      <w:lvlJc w:val="left"/>
+      <w:pPr>
+        <w:ind w:left="1440" w:hanging="360"/>
+      </w:pPr>
+    </w:lvl>
+    <w:lvl w:ilvl="2" w:tplc="0409001B" w:tentative="1">
+      <w:start w:val="1"/>
+      <w:numFmt w:val="lowerRoman"/>
+      <w:lvlText w:val="%3."/>
+      <w:lvlJc w:val="right"/>
+      <w:pPr>
+        <w:ind w:left="2160" w:hanging="180"/>
+      </w:pPr>
+    </w:lvl>
+    <w:lvl w:ilvl="3" w:tplc="0409000F" w:tentative="1">
+      <w:start w:val="1"/>
+      <w:numFmt w:val="decimal"/>
+      <w:lvlText w:val="%4."/>
+      <w:lvlJc w:val="left"/>
+      <w:pPr>
+        <w:ind w:left="2880" w:hanging="360"/>
+      </w:pPr>
+    </w:lvl>
+    <w:lvl w:ilvl="4" w:tplc="04090019" w:tentative="1">
+      <w:start w:val="1"/>
+      <w:numFmt w:val="lowerLetter"/>
+      <w:lvlText w:val="%5."/>
+      <w:lvlJc w:val="left"/>
+      <w:pPr>
+        <w:ind w:left="3600" w:hanging="360"/>
+      </w:pPr>
+    </w:lvl>
+    <w:lvl w:ilvl="5" w:tplc="0409001B" w:tentative="1">
+      <w:start w:val="1"/>
+      <w:numFmt w:val="lowerRoman"/>
+      <w:lvlText w:val="%6."/>
+      <w:lvlJc w:val="right"/>
+      <w:pPr>
+        <w:ind w:left="4320" w:hanging="180"/>
+      </w:pPr>
+    </w:lvl>
+    <w:lvl w:ilvl="6" w:tplc="0409000F" w:tentative="1">
+      <w:start w:val="1"/>
+      <w:numFmt w:val="decimal"/>
+      <w:lvlText w:val="%7."/>
+      <w:lvlJc w:val="left"/>
+      <w:pPr>
+        <w:ind w:left="5040" w:hanging="360"/>
+      </w:pPr>
+    </w:lvl>
+    <w:lvl w:ilvl="7" w:tplc="04090019" w:tentative="1">
+      <w:start w:val="1"/>
+      <w:numFmt w:val="lowerLetter"/>
+      <w:lvlText w:val="%8."/>
+      <w:lvlJc w:val="left"/>
+      <w:pPr>
+        <w:ind w:left="5760" w:hanging="360"/>
+      </w:pPr>
+    </w:lvl>
+    <w:lvl w:ilvl="8" w:tplc="0409001B" w:tentative="1">
+      <w:start w:val="1"/>
+      <w:numFmt w:val="lowerRoman"/>
+      <w:lvlText w:val="%9."/>
+      <w:lvlJc w:val="right"/>
+      <w:pPr>
+        <w:ind w:left="6480" w:hanging="180"/>
+      </w:pPr>
+    </w:lvl>
+  </w:abstractNum>
+  <w:abstractNum w:abstractNumId="14" w15:restartNumberingAfterBreak="0">
     <w:nsid w:val="7BC93317"/>
     <w:multiLevelType w:val="multilevel"/>
     <w:tmpl w:val="0409001F"/>
@@ -5745,53 +6131,56 @@
       </w:pPr>
     </w:lvl>
   </w:abstractNum>
-  <w:num w:numId="1" w16cid:durableId="1464345646">
+  <w:num w:numId="1">
     <w:abstractNumId w:val="1"/>
   </w:num>
-  <w:num w:numId="2" w16cid:durableId="1348755695">
+  <w:num w:numId="2">
     <w:abstractNumId w:val="3"/>
   </w:num>
-  <w:num w:numId="3" w16cid:durableId="599216494">
+  <w:num w:numId="3">
     <w:abstractNumId w:val="12"/>
   </w:num>
-  <w:num w:numId="4" w16cid:durableId="808673154">
+  <w:num w:numId="4">
     <w:abstractNumId w:val="4"/>
   </w:num>
-  <w:num w:numId="5" w16cid:durableId="385186429">
+  <w:num w:numId="5">
     <w:abstractNumId w:val="8"/>
   </w:num>
-  <w:num w:numId="6" w16cid:durableId="32460784">
+  <w:num w:numId="6">
     <w:abstractNumId w:val="7"/>
   </w:num>
-  <w:num w:numId="7" w16cid:durableId="1818912224">
+  <w:num w:numId="7">
     <w:abstractNumId w:val="10"/>
   </w:num>
-  <w:num w:numId="8" w16cid:durableId="996492363">
+  <w:num w:numId="8">
     <w:abstractNumId w:val="6"/>
   </w:num>
-  <w:num w:numId="9" w16cid:durableId="582027270">
+  <w:num w:numId="9">
     <w:abstractNumId w:val="2"/>
   </w:num>
-  <w:num w:numId="10" w16cid:durableId="1888838204">
+  <w:num w:numId="10">
     <w:abstractNumId w:val="11"/>
   </w:num>
-  <w:num w:numId="11" w16cid:durableId="711270914">
+  <w:num w:numId="11">
     <w:abstractNumId w:val="5"/>
   </w:num>
-  <w:num w:numId="12" w16cid:durableId="1972517053">
+  <w:num w:numId="12">
     <w:abstractNumId w:val="9"/>
   </w:num>
-  <w:num w:numId="13" w16cid:durableId="737944378">
+  <w:num w:numId="13">
     <w:abstractNumId w:val="0"/>
   </w:num>
-  <w:num w:numId="14" w16cid:durableId="185944872">
+  <w:num w:numId="14">
+    <w:abstractNumId w:val="14"/>
+  </w:num>
+  <w:num w:numId="15">
     <w:abstractNumId w:val="13"/>
   </w:num>
 </w:numbering>
 </file>
 
 <file path=word/styles.xml><?xml version="1.0" encoding="utf-8"?>
-<w:styles xmlns:mc="http://schemas.openxmlformats.org/markup-compatibility/2006" xmlns:r="http://schemas.openxmlformats.org/officeDocument/2006/relationships" xmlns:w="http://schemas.openxmlformats.org/wordprocessingml/2006/main" xmlns:w14="http://schemas.microsoft.com/office/word/2010/wordml" xmlns:w15="http://schemas.microsoft.com/office/word/2012/wordml" xmlns:w16cex="http://schemas.microsoft.com/office/word/2018/wordml/cex" xmlns:w16cid="http://schemas.microsoft.com/office/word/2016/wordml/cid" xmlns:w16="http://schemas.microsoft.com/office/word/2018/wordml" xmlns:w16du="http://schemas.microsoft.com/office/word/2023/wordml/word16du" xmlns:w16sdtdh="http://schemas.microsoft.com/office/word/2020/wordml/sdtdatahash" xmlns:w16sdtfl="http://schemas.microsoft.com/office/word/2024/wordml/sdtformatlock" xmlns:w16se="http://schemas.microsoft.com/office/word/2015/wordml/symex" mc:Ignorable="w14 w15 w16se w16cid w16 w16cex w16sdtdh w16sdtfl w16du">
+<w:styles xmlns:mc="http://schemas.openxmlformats.org/markup-compatibility/2006" xmlns:r="http://schemas.openxmlformats.org/officeDocument/2006/relationships" xmlns:w="http://schemas.openxmlformats.org/wordprocessingml/2006/main" xmlns:w14="http://schemas.microsoft.com/office/word/2010/wordml" xmlns:w15="http://schemas.microsoft.com/office/word/2012/wordml" xmlns:w16cex="http://schemas.microsoft.com/office/word/2018/wordml/cex" xmlns:w16cid="http://schemas.microsoft.com/office/word/2016/wordml/cid" xmlns:w16="http://schemas.microsoft.com/office/word/2018/wordml" xmlns:w16sdtdh="http://schemas.microsoft.com/office/word/2020/wordml/sdtdatahash" xmlns:w16se="http://schemas.microsoft.com/office/word/2015/wordml/symex" mc:Ignorable="w14 w15 w16se w16cid w16 w16cex w16sdtdh">
   <w:docDefaults>
     <w:rPrDefault>
       <w:rPr>
@@ -6393,7 +6782,6 @@
   <w:style w:type="character" w:default="1" w:styleId="DefaultParagraphFont">
     <w:name w:val="Default Paragraph Font"/>
     <w:uiPriority w:val="1"/>
-    <w:semiHidden/>
     <w:unhideWhenUsed/>
   </w:style>
   <w:style w:type="table" w:default="1" w:styleId="TableNormal">

</xml_diff>

<commit_message>
add index.html & css
</commit_message>
<xml_diff>
--- a/Final-Term Project-DevOps-Fall2024.docx
+++ b/Final-Term Project-DevOps-Fall2024.docx
@@ -340,6 +340,13 @@
           <w:szCs w:val="24"/>
         </w:rPr>
         <w:t>.</w:t>
+      </w:r>
+      <w:r>
+        <w:rPr>
+          <w:sz w:val="24"/>
+          <w:szCs w:val="24"/>
+        </w:rPr>
+        <w:t xml:space="preserve"> Detail given in table: 02</w:t>
       </w:r>
     </w:p>
     <w:p>
@@ -517,11 +524,11 @@
         <w:tblLook w:val="04A0" w:firstRow="1" w:lastRow="0" w:firstColumn="1" w:lastColumn="0" w:noHBand="0" w:noVBand="1"/>
       </w:tblPr>
       <w:tblGrid>
-        <w:gridCol w:w="625"/>
-        <w:gridCol w:w="2520"/>
-        <w:gridCol w:w="2520"/>
-        <w:gridCol w:w="1620"/>
-        <w:gridCol w:w="2160"/>
+        <w:gridCol w:w="612"/>
+        <w:gridCol w:w="2439"/>
+        <w:gridCol w:w="2467"/>
+        <w:gridCol w:w="1582"/>
+        <w:gridCol w:w="2345"/>
       </w:tblGrid>
       <w:tr>
         <w:trPr>
@@ -556,25 +563,7 @@
                 <w:bCs/>
                 <w:color w:val="FF0000"/>
               </w:rPr>
-              <w:t>[</w:t>
-            </w:r>
-            <w:r>
-              <w:rPr>
-                <w:rFonts w:ascii="Calibri" w:hAnsi="Calibri" w:cs="Calibri"/>
-                <w:b/>
-                <w:bCs/>
-                <w:color w:val="FF0000"/>
-              </w:rPr>
-              <w:t xml:space="preserve">Paste Group Repository </w:t>
-            </w:r>
-            <w:r>
-              <w:rPr>
-                <w:rFonts w:ascii="Calibri" w:hAnsi="Calibri" w:cs="Calibri"/>
-                <w:b/>
-                <w:bCs/>
-                <w:color w:val="FF0000"/>
-              </w:rPr>
-              <w:t>URL Here]</w:t>
+              <w:t>https://github.com/saadmahmooood/term-project-f24.git</w:t>
             </w:r>
           </w:p>
         </w:tc>
@@ -603,7 +592,16 @@
                 <w:b/>
                 <w:bCs/>
               </w:rPr>
-              <w:t xml:space="preserve">Website URL:  </w:t>
+              <w:t>Website URL</w:t>
+            </w:r>
+            <w:proofErr w:type="gramStart"/>
+            <w:r>
+              <w:rPr>
+                <w:rFonts w:ascii="Calibri" w:hAnsi="Calibri" w:cs="Calibri"/>
+                <w:b/>
+                <w:bCs/>
+              </w:rPr>
+              <w:t xml:space="preserve">:  </w:t>
             </w:r>
             <w:r>
               <w:rPr>
@@ -614,6 +612,7 @@
               </w:rPr>
               <w:t>[</w:t>
             </w:r>
+            <w:proofErr w:type="gramEnd"/>
             <w:r>
               <w:rPr>
                 <w:rFonts w:ascii="Calibri" w:hAnsi="Calibri" w:cs="Calibri"/>
@@ -643,7 +642,7 @@
           <w:tcPr>
             <w:tcW w:w="9445" w:type="dxa"/>
             <w:gridSpan w:val="5"/>
-            <w:shd w:val="clear" w:color="auto" w:fill="D9D9D9" w:themeFill="background1" w:themeFillShade="D9"/>
+            <w:shd w:val="clear" w:color="auto" w:fill="FFD966" w:themeFill="accent4" w:themeFillTint="99"/>
             <w:vAlign w:val="center"/>
           </w:tcPr>
           <w:p>
@@ -671,7 +670,7 @@
         </w:trPr>
         <w:tc>
           <w:tcPr>
-            <w:tcW w:w="625" w:type="dxa"/>
+            <w:tcW w:w="612" w:type="dxa"/>
             <w:vAlign w:val="center"/>
           </w:tcPr>
           <w:p>
@@ -694,7 +693,7 @@
         </w:tc>
         <w:tc>
           <w:tcPr>
-            <w:tcW w:w="2520" w:type="dxa"/>
+            <w:tcW w:w="2439" w:type="dxa"/>
             <w:vAlign w:val="center"/>
           </w:tcPr>
           <w:p>
@@ -717,7 +716,7 @@
         </w:tc>
         <w:tc>
           <w:tcPr>
-            <w:tcW w:w="2520" w:type="dxa"/>
+            <w:tcW w:w="2467" w:type="dxa"/>
             <w:vAlign w:val="center"/>
           </w:tcPr>
           <w:p>
@@ -740,7 +739,7 @@
         </w:tc>
         <w:tc>
           <w:tcPr>
-            <w:tcW w:w="1620" w:type="dxa"/>
+            <w:tcW w:w="1582" w:type="dxa"/>
             <w:vAlign w:val="center"/>
           </w:tcPr>
           <w:p>
@@ -763,7 +762,7 @@
         </w:tc>
         <w:tc>
           <w:tcPr>
-            <w:tcW w:w="2160" w:type="dxa"/>
+            <w:tcW w:w="2345" w:type="dxa"/>
           </w:tcPr>
           <w:p>
             <w:pPr>
@@ -795,8 +794,18 @@
                 <w:b/>
                 <w:bCs/>
               </w:rPr>
-              <w:t xml:space="preserve"> worked On</w:t>
-            </w:r>
+              <w:t xml:space="preserve"> worked </w:t>
+            </w:r>
+            <w:proofErr w:type="gramStart"/>
+            <w:r>
+              <w:rPr>
+                <w:rFonts w:ascii="Calibri" w:hAnsi="Calibri" w:cs="Calibri"/>
+                <w:b/>
+                <w:bCs/>
+              </w:rPr>
+              <w:t>On</w:t>
+            </w:r>
+            <w:proofErr w:type="gramEnd"/>
           </w:p>
         </w:tc>
       </w:tr>
@@ -806,7 +815,7 @@
         </w:trPr>
         <w:tc>
           <w:tcPr>
-            <w:tcW w:w="625" w:type="dxa"/>
+            <w:tcW w:w="612" w:type="dxa"/>
             <w:vAlign w:val="center"/>
           </w:tcPr>
           <w:p>
@@ -830,7 +839,7 @@
         </w:tc>
         <w:tc>
           <w:tcPr>
-            <w:tcW w:w="2520" w:type="dxa"/>
+            <w:tcW w:w="2439" w:type="dxa"/>
             <w:vAlign w:val="center"/>
           </w:tcPr>
           <w:p>
@@ -841,11 +850,19 @@
                 <w:bCs/>
               </w:rPr>
             </w:pPr>
+            <w:r>
+              <w:rPr>
+                <w:rFonts w:ascii="Calibri" w:hAnsi="Calibri" w:cs="Calibri"/>
+                <w:b/>
+                <w:bCs/>
+              </w:rPr>
+              <w:t>Hafiz Saad Mahmood</w:t>
+            </w:r>
           </w:p>
         </w:tc>
         <w:tc>
           <w:tcPr>
-            <w:tcW w:w="2520" w:type="dxa"/>
+            <w:tcW w:w="2467" w:type="dxa"/>
             <w:vAlign w:val="center"/>
           </w:tcPr>
           <w:p>
@@ -856,11 +873,19 @@
                 <w:bCs/>
               </w:rPr>
             </w:pPr>
+            <w:r>
+              <w:rPr>
+                <w:rFonts w:ascii="Calibri" w:hAnsi="Calibri" w:cs="Calibri"/>
+                <w:b/>
+                <w:bCs/>
+              </w:rPr>
+              <w:t>L1F21BSSE0491</w:t>
+            </w:r>
           </w:p>
         </w:tc>
         <w:tc>
           <w:tcPr>
-            <w:tcW w:w="1620" w:type="dxa"/>
+            <w:tcW w:w="1582" w:type="dxa"/>
           </w:tcPr>
           <w:p>
             <w:pPr>
@@ -878,7 +903,7 @@
         </w:tc>
         <w:tc>
           <w:tcPr>
-            <w:tcW w:w="2160" w:type="dxa"/>
+            <w:tcW w:w="2345" w:type="dxa"/>
           </w:tcPr>
           <w:p>
             <w:pPr>
@@ -886,6 +911,18 @@
                 <w:rFonts w:ascii="Calibri" w:hAnsi="Calibri" w:cs="Calibri"/>
               </w:rPr>
             </w:pPr>
+            <w:r>
+              <w:rPr>
+                <w:rFonts w:ascii="Calibri" w:hAnsi="Calibri" w:cs="Calibri"/>
+              </w:rPr>
+              <w:t>Develop/ci</w:t>
+            </w:r>
+            <w:r>
+              <w:rPr>
+                <w:rFonts w:ascii="Calibri" w:hAnsi="Calibri" w:cs="Calibri"/>
+              </w:rPr>
+              <w:t>/Home-Page</w:t>
+            </w:r>
           </w:p>
         </w:tc>
       </w:tr>
@@ -895,7 +932,7 @@
         </w:trPr>
         <w:tc>
           <w:tcPr>
-            <w:tcW w:w="625" w:type="dxa"/>
+            <w:tcW w:w="612" w:type="dxa"/>
             <w:vAlign w:val="center"/>
           </w:tcPr>
           <w:p>
@@ -919,7 +956,7 @@
         </w:tc>
         <w:tc>
           <w:tcPr>
-            <w:tcW w:w="2520" w:type="dxa"/>
+            <w:tcW w:w="2439" w:type="dxa"/>
             <w:vAlign w:val="center"/>
           </w:tcPr>
           <w:p>
@@ -930,11 +967,19 @@
                 <w:bCs/>
               </w:rPr>
             </w:pPr>
+            <w:r>
+              <w:rPr>
+                <w:rFonts w:ascii="Calibri" w:hAnsi="Calibri" w:cs="Calibri"/>
+                <w:b/>
+                <w:bCs/>
+              </w:rPr>
+              <w:t>Abdul Basit</w:t>
+            </w:r>
           </w:p>
         </w:tc>
         <w:tc>
           <w:tcPr>
-            <w:tcW w:w="2520" w:type="dxa"/>
+            <w:tcW w:w="2467" w:type="dxa"/>
             <w:vAlign w:val="center"/>
           </w:tcPr>
           <w:p>
@@ -945,11 +990,19 @@
                 <w:bCs/>
               </w:rPr>
             </w:pPr>
+            <w:r>
+              <w:rPr>
+                <w:rFonts w:ascii="Calibri" w:hAnsi="Calibri" w:cs="Calibri"/>
+                <w:b/>
+                <w:bCs/>
+              </w:rPr>
+              <w:t>L1F21BSSE0513</w:t>
+            </w:r>
           </w:p>
         </w:tc>
         <w:tc>
           <w:tcPr>
-            <w:tcW w:w="1620" w:type="dxa"/>
+            <w:tcW w:w="1582" w:type="dxa"/>
           </w:tcPr>
           <w:p>
             <w:pPr>
@@ -967,7 +1020,7 @@
         </w:tc>
         <w:tc>
           <w:tcPr>
-            <w:tcW w:w="2160" w:type="dxa"/>
+            <w:tcW w:w="2345" w:type="dxa"/>
           </w:tcPr>
           <w:p>
             <w:pPr>
@@ -975,6 +1028,24 @@
                 <w:rFonts w:ascii="Calibri" w:hAnsi="Calibri" w:cs="Calibri"/>
               </w:rPr>
             </w:pPr>
+            <w:r>
+              <w:rPr>
+                <w:rFonts w:ascii="Calibri" w:hAnsi="Calibri" w:cs="Calibri"/>
+              </w:rPr>
+              <w:t>Develop/c</w:t>
+            </w:r>
+            <w:r>
+              <w:rPr>
+                <w:rFonts w:ascii="Calibri" w:hAnsi="Calibri" w:cs="Calibri"/>
+              </w:rPr>
+              <w:t>d</w:t>
+            </w:r>
+            <w:r>
+              <w:rPr>
+                <w:rFonts w:ascii="Calibri" w:hAnsi="Calibri" w:cs="Calibri"/>
+              </w:rPr>
+              <w:t>/About-us</w:t>
+            </w:r>
           </w:p>
         </w:tc>
       </w:tr>
@@ -984,7 +1055,7 @@
         </w:trPr>
         <w:tc>
           <w:tcPr>
-            <w:tcW w:w="625" w:type="dxa"/>
+            <w:tcW w:w="612" w:type="dxa"/>
             <w:vAlign w:val="center"/>
           </w:tcPr>
           <w:p>
@@ -1008,7 +1079,7 @@
         </w:tc>
         <w:tc>
           <w:tcPr>
-            <w:tcW w:w="2520" w:type="dxa"/>
+            <w:tcW w:w="2439" w:type="dxa"/>
             <w:vAlign w:val="center"/>
           </w:tcPr>
           <w:p>
@@ -1019,11 +1090,19 @@
                 <w:bCs/>
               </w:rPr>
             </w:pPr>
+            <w:r>
+              <w:rPr>
+                <w:rFonts w:ascii="Calibri" w:hAnsi="Calibri" w:cs="Calibri"/>
+                <w:b/>
+                <w:bCs/>
+              </w:rPr>
+              <w:t>Aaliyan Umar</w:t>
+            </w:r>
           </w:p>
         </w:tc>
         <w:tc>
           <w:tcPr>
-            <w:tcW w:w="2520" w:type="dxa"/>
+            <w:tcW w:w="2467" w:type="dxa"/>
             <w:vAlign w:val="center"/>
           </w:tcPr>
           <w:p>
@@ -1034,11 +1113,19 @@
                 <w:bCs/>
               </w:rPr>
             </w:pPr>
+            <w:r>
+              <w:rPr>
+                <w:rFonts w:ascii="Calibri" w:hAnsi="Calibri" w:cs="Calibri"/>
+                <w:b/>
+                <w:bCs/>
+              </w:rPr>
+              <w:t>L1F21BSSE0395</w:t>
+            </w:r>
           </w:p>
         </w:tc>
         <w:tc>
           <w:tcPr>
-            <w:tcW w:w="1620" w:type="dxa"/>
+            <w:tcW w:w="1582" w:type="dxa"/>
           </w:tcPr>
           <w:p>
             <w:pPr>
@@ -1056,7 +1143,7 @@
         </w:tc>
         <w:tc>
           <w:tcPr>
-            <w:tcW w:w="2160" w:type="dxa"/>
+            <w:tcW w:w="2345" w:type="dxa"/>
           </w:tcPr>
           <w:p>
             <w:pPr>
@@ -1064,6 +1151,24 @@
                 <w:rFonts w:ascii="Calibri" w:hAnsi="Calibri" w:cs="Calibri"/>
               </w:rPr>
             </w:pPr>
+            <w:r>
+              <w:rPr>
+                <w:rFonts w:ascii="Calibri" w:hAnsi="Calibri" w:cs="Calibri"/>
+              </w:rPr>
+              <w:t>staging</w:t>
+            </w:r>
+            <w:r>
+              <w:rPr>
+                <w:rFonts w:ascii="Calibri" w:hAnsi="Calibri" w:cs="Calibri"/>
+              </w:rPr>
+              <w:t>/ci</w:t>
+            </w:r>
+            <w:r>
+              <w:rPr>
+                <w:rFonts w:ascii="Calibri" w:hAnsi="Calibri" w:cs="Calibri"/>
+              </w:rPr>
+              <w:t>/Services</w:t>
+            </w:r>
           </w:p>
         </w:tc>
       </w:tr>
@@ -1073,7 +1178,7 @@
         </w:trPr>
         <w:tc>
           <w:tcPr>
-            <w:tcW w:w="625" w:type="dxa"/>
+            <w:tcW w:w="612" w:type="dxa"/>
             <w:vAlign w:val="center"/>
           </w:tcPr>
           <w:p>
@@ -1097,7 +1202,7 @@
         </w:tc>
         <w:tc>
           <w:tcPr>
-            <w:tcW w:w="2520" w:type="dxa"/>
+            <w:tcW w:w="2439" w:type="dxa"/>
             <w:vAlign w:val="center"/>
           </w:tcPr>
           <w:p>
@@ -1108,11 +1213,19 @@
                 <w:bCs/>
               </w:rPr>
             </w:pPr>
+            <w:r>
+              <w:rPr>
+                <w:rFonts w:ascii="Calibri" w:hAnsi="Calibri" w:cs="Calibri"/>
+                <w:b/>
+                <w:bCs/>
+              </w:rPr>
+              <w:t>Kamran Sajjad</w:t>
+            </w:r>
           </w:p>
         </w:tc>
         <w:tc>
           <w:tcPr>
-            <w:tcW w:w="2520" w:type="dxa"/>
+            <w:tcW w:w="2467" w:type="dxa"/>
             <w:vAlign w:val="center"/>
           </w:tcPr>
           <w:p>
@@ -1123,11 +1236,19 @@
                 <w:bCs/>
               </w:rPr>
             </w:pPr>
+            <w:r>
+              <w:rPr>
+                <w:rFonts w:ascii="Calibri" w:hAnsi="Calibri" w:cs="Calibri"/>
+                <w:b/>
+                <w:bCs/>
+              </w:rPr>
+              <w:t>L1F21BSSE0452</w:t>
+            </w:r>
           </w:p>
         </w:tc>
         <w:tc>
           <w:tcPr>
-            <w:tcW w:w="1620" w:type="dxa"/>
+            <w:tcW w:w="1582" w:type="dxa"/>
           </w:tcPr>
           <w:p>
             <w:pPr>
@@ -1145,7 +1266,7 @@
         </w:tc>
         <w:tc>
           <w:tcPr>
-            <w:tcW w:w="2160" w:type="dxa"/>
+            <w:tcW w:w="2345" w:type="dxa"/>
           </w:tcPr>
           <w:p>
             <w:pPr>
@@ -1153,6 +1274,24 @@
                 <w:rFonts w:ascii="Calibri" w:hAnsi="Calibri" w:cs="Calibri"/>
               </w:rPr>
             </w:pPr>
+            <w:r>
+              <w:rPr>
+                <w:rFonts w:ascii="Calibri" w:hAnsi="Calibri" w:cs="Calibri"/>
+              </w:rPr>
+              <w:t>staging/c</w:t>
+            </w:r>
+            <w:r>
+              <w:rPr>
+                <w:rFonts w:ascii="Calibri" w:hAnsi="Calibri" w:cs="Calibri"/>
+              </w:rPr>
+              <w:t>d</w:t>
+            </w:r>
+            <w:r>
+              <w:rPr>
+                <w:rFonts w:ascii="Calibri" w:hAnsi="Calibri" w:cs="Calibri"/>
+              </w:rPr>
+              <w:t>/Portfolio</w:t>
+            </w:r>
           </w:p>
         </w:tc>
       </w:tr>
@@ -1162,7 +1301,7 @@
         </w:trPr>
         <w:tc>
           <w:tcPr>
-            <w:tcW w:w="625" w:type="dxa"/>
+            <w:tcW w:w="612" w:type="dxa"/>
             <w:vAlign w:val="center"/>
           </w:tcPr>
           <w:p>
@@ -1186,7 +1325,7 @@
         </w:tc>
         <w:tc>
           <w:tcPr>
-            <w:tcW w:w="2520" w:type="dxa"/>
+            <w:tcW w:w="2439" w:type="dxa"/>
             <w:vAlign w:val="center"/>
           </w:tcPr>
           <w:p>
@@ -1197,11 +1336,19 @@
                 <w:bCs/>
               </w:rPr>
             </w:pPr>
+            <w:r>
+              <w:rPr>
+                <w:rFonts w:ascii="Calibri" w:hAnsi="Calibri" w:cs="Calibri"/>
+                <w:b/>
+                <w:bCs/>
+              </w:rPr>
+              <w:t>Samiullah</w:t>
+            </w:r>
           </w:p>
         </w:tc>
         <w:tc>
           <w:tcPr>
-            <w:tcW w:w="2520" w:type="dxa"/>
+            <w:tcW w:w="2467" w:type="dxa"/>
             <w:vAlign w:val="center"/>
           </w:tcPr>
           <w:p>
@@ -1212,11 +1359,19 @@
                 <w:bCs/>
               </w:rPr>
             </w:pPr>
+            <w:r>
+              <w:rPr>
+                <w:rFonts w:ascii="Calibri" w:hAnsi="Calibri" w:cs="Calibri"/>
+                <w:b/>
+                <w:bCs/>
+              </w:rPr>
+              <w:t>L1F21BSSE0492</w:t>
+            </w:r>
           </w:p>
         </w:tc>
         <w:tc>
           <w:tcPr>
-            <w:tcW w:w="1620" w:type="dxa"/>
+            <w:tcW w:w="1582" w:type="dxa"/>
           </w:tcPr>
           <w:p>
             <w:pPr>
@@ -1234,7 +1389,7 @@
         </w:tc>
         <w:tc>
           <w:tcPr>
-            <w:tcW w:w="2160" w:type="dxa"/>
+            <w:tcW w:w="2345" w:type="dxa"/>
           </w:tcPr>
           <w:p>
             <w:pPr>
@@ -1242,6 +1397,24 @@
                 <w:rFonts w:ascii="Calibri" w:hAnsi="Calibri" w:cs="Calibri"/>
               </w:rPr>
             </w:pPr>
+            <w:r>
+              <w:rPr>
+                <w:rFonts w:ascii="Calibri" w:hAnsi="Calibri" w:cs="Calibri"/>
+              </w:rPr>
+              <w:t>production</w:t>
+            </w:r>
+            <w:r>
+              <w:rPr>
+                <w:rFonts w:ascii="Calibri" w:hAnsi="Calibri" w:cs="Calibri"/>
+              </w:rPr>
+              <w:t>/ci</w:t>
+            </w:r>
+            <w:r>
+              <w:rPr>
+                <w:rFonts w:ascii="Calibri" w:hAnsi="Calibri" w:cs="Calibri"/>
+              </w:rPr>
+              <w:t>/Blog</w:t>
+            </w:r>
           </w:p>
         </w:tc>
       </w:tr>
@@ -1251,7 +1424,7 @@
         </w:trPr>
         <w:tc>
           <w:tcPr>
-            <w:tcW w:w="625" w:type="dxa"/>
+            <w:tcW w:w="612" w:type="dxa"/>
             <w:vAlign w:val="center"/>
           </w:tcPr>
           <w:p>
@@ -1275,7 +1448,7 @@
         </w:tc>
         <w:tc>
           <w:tcPr>
-            <w:tcW w:w="2520" w:type="dxa"/>
+            <w:tcW w:w="2439" w:type="dxa"/>
             <w:vAlign w:val="center"/>
           </w:tcPr>
           <w:p>
@@ -1286,11 +1459,19 @@
                 <w:bCs/>
               </w:rPr>
             </w:pPr>
+            <w:r>
+              <w:rPr>
+                <w:rFonts w:ascii="Calibri" w:hAnsi="Calibri" w:cs="Calibri"/>
+                <w:b/>
+                <w:bCs/>
+              </w:rPr>
+              <w:t>Hamza Raza Hussain</w:t>
+            </w:r>
           </w:p>
         </w:tc>
         <w:tc>
           <w:tcPr>
-            <w:tcW w:w="2520" w:type="dxa"/>
+            <w:tcW w:w="2467" w:type="dxa"/>
             <w:vAlign w:val="center"/>
           </w:tcPr>
           <w:p>
@@ -1301,11 +1482,19 @@
                 <w:bCs/>
               </w:rPr>
             </w:pPr>
+            <w:r>
+              <w:rPr>
+                <w:rFonts w:ascii="Calibri" w:hAnsi="Calibri" w:cs="Calibri"/>
+                <w:b/>
+                <w:bCs/>
+              </w:rPr>
+              <w:t>L1F21BSSE0507</w:t>
+            </w:r>
           </w:p>
         </w:tc>
         <w:tc>
           <w:tcPr>
-            <w:tcW w:w="1620" w:type="dxa"/>
+            <w:tcW w:w="1582" w:type="dxa"/>
           </w:tcPr>
           <w:p>
             <w:pPr>
@@ -1323,7 +1512,7 @@
         </w:tc>
         <w:tc>
           <w:tcPr>
-            <w:tcW w:w="2160" w:type="dxa"/>
+            <w:tcW w:w="2345" w:type="dxa"/>
           </w:tcPr>
           <w:p>
             <w:pPr>
@@ -1331,13 +1520,31 @@
                 <w:rFonts w:ascii="Calibri" w:hAnsi="Calibri" w:cs="Calibri"/>
               </w:rPr>
             </w:pPr>
+            <w:r>
+              <w:rPr>
+                <w:rFonts w:ascii="Calibri" w:hAnsi="Calibri" w:cs="Calibri"/>
+              </w:rPr>
+              <w:t>production</w:t>
+            </w:r>
+            <w:r>
+              <w:rPr>
+                <w:rFonts w:ascii="Calibri" w:hAnsi="Calibri" w:cs="Calibri"/>
+              </w:rPr>
+              <w:t>/c</w:t>
+            </w:r>
+            <w:r>
+              <w:rPr>
+                <w:rFonts w:ascii="Calibri" w:hAnsi="Calibri" w:cs="Calibri"/>
+              </w:rPr>
+              <w:t>d/Contact-us</w:t>
+            </w:r>
           </w:p>
         </w:tc>
       </w:tr>
     </w:tbl>
     <w:p>
       <w:pPr>
-        <w:shd w:val="clear" w:color="auto" w:fill="BFBFBF" w:themeFill="background1" w:themeFillShade="BF"/>
+        <w:shd w:val="clear" w:color="auto" w:fill="FFFFFF" w:themeFill="background1"/>
         <w:rPr>
           <w:b/>
           <w:bCs/>
@@ -1878,7 +2085,21 @@
           <w:sz w:val="24"/>
           <w:szCs w:val="24"/>
         </w:rPr>
-        <w:t xml:space="preserve">Quality and adherence to linting </w:t>
+        <w:t>Quality and adherence to linting</w:t>
+      </w:r>
+      <w:r>
+        <w:rPr>
+          <w:sz w:val="24"/>
+          <w:szCs w:val="24"/>
+        </w:rPr>
+        <w:t>.</w:t>
+      </w:r>
+      <w:r>
+        <w:rPr>
+          <w:sz w:val="24"/>
+          <w:szCs w:val="24"/>
+        </w:rPr>
+        <w:t xml:space="preserve"> </w:t>
       </w:r>
       <w:r>
         <w:rPr>
@@ -1903,7 +2124,7 @@
           <w:sz w:val="24"/>
           <w:szCs w:val="24"/>
         </w:rPr>
-        <w:t>2</w:t>
+        <w:t>1</w:t>
       </w:r>
       <w:r>
         <w:rPr>
@@ -2105,6 +2326,31 @@
         <w:t>]</w:t>
       </w:r>
     </w:p>
+    <w:p>
+      <w:pPr>
+        <w:shd w:val="clear" w:color="auto" w:fill="D9E2F3" w:themeFill="accent1" w:themeFillTint="33"/>
+        <w:ind w:left="5040" w:firstLine="720"/>
+      </w:pPr>
+      <w:r>
+        <w:rPr>
+          <w:b/>
+          <w:bCs/>
+          <w:sz w:val="24"/>
+          <w:szCs w:val="24"/>
+        </w:rPr>
+        <w:t>Total Marks:</w:t>
+      </w:r>
+      <w:r>
+        <w:rPr>
+          <w:b/>
+          <w:bCs/>
+          <w:sz w:val="24"/>
+          <w:szCs w:val="24"/>
+        </w:rPr>
+        <w:tab/>
+        <w:t>[100 Marks]</w:t>
+      </w:r>
+    </w:p>
     <w:p/>
     <w:p>
       <w:pPr>
@@ -2123,7 +2369,6 @@
           <w:sz w:val="48"/>
           <w:szCs w:val="48"/>
         </w:rPr>
-        <w:lastRenderedPageBreak/>
         <w:t xml:space="preserve">List of </w:t>
       </w:r>
       <w:r>
@@ -2437,94 +2682,861 @@
           <w:sz w:val="24"/>
           <w:szCs w:val="24"/>
         </w:rPr>
-        <w:t>3.1. Assign team members to create workflows for specific environments:</w:t>
+        <w:t>3.1. Assign team members to create workflows for specific environments</w:t>
+      </w:r>
+      <w:r>
+        <w:rPr>
+          <w:sz w:val="24"/>
+          <w:szCs w:val="24"/>
+        </w:rPr>
+        <w:t>. Following is guideline in order to decide on the number of workflows in your repository</w:t>
+      </w:r>
+      <w:r>
+        <w:rPr>
+          <w:sz w:val="24"/>
+          <w:szCs w:val="24"/>
+        </w:rPr>
+        <w:t xml:space="preserve"> for each </w:t>
+      </w:r>
+      <w:proofErr w:type="spellStart"/>
+      <w:r>
+        <w:rPr>
+          <w:sz w:val="24"/>
+          <w:szCs w:val="24"/>
+        </w:rPr>
+        <w:t>environemtn</w:t>
+      </w:r>
+      <w:proofErr w:type="spellEnd"/>
+      <w:r>
+        <w:rPr>
+          <w:sz w:val="24"/>
+          <w:szCs w:val="24"/>
+        </w:rPr>
+        <w:t xml:space="preserve">. </w:t>
       </w:r>
     </w:p>
     <w:p>
       <w:pPr>
-        <w:pStyle w:val="ListParagraph"/>
-        <w:numPr>
-          <w:ilvl w:val="0"/>
-          <w:numId w:val="11"/>
-        </w:numPr>
-        <w:rPr>
-          <w:sz w:val="24"/>
-          <w:szCs w:val="24"/>
-        </w:rPr>
-      </w:pPr>
-      <w:r>
-        <w:rPr>
-          <w:b/>
-          <w:bCs/>
-          <w:sz w:val="24"/>
-          <w:szCs w:val="24"/>
-        </w:rPr>
-        <w:t>Development Workflow</w:t>
-      </w:r>
-      <w:r>
-        <w:rPr>
-          <w:sz w:val="24"/>
-          <w:szCs w:val="24"/>
-        </w:rPr>
-        <w:t>: Triggered on pushes to the develop branch. Lints, builds, and deploys to the development environment.</w:t>
+        <w:rPr>
+          <w:b/>
+          <w:bCs/>
+          <w:sz w:val="24"/>
+          <w:szCs w:val="24"/>
+        </w:rPr>
+      </w:pPr>
+      <w:r>
+        <w:rPr>
+          <w:b/>
+          <w:bCs/>
+          <w:sz w:val="24"/>
+          <w:szCs w:val="24"/>
+        </w:rPr>
+        <w:t>Recommended</w:t>
+      </w:r>
+      <w:r>
+        <w:rPr>
+          <w:b/>
+          <w:bCs/>
+          <w:sz w:val="24"/>
+          <w:szCs w:val="24"/>
+        </w:rPr>
+        <w:t xml:space="preserve"> Workflow Triggers</w:t>
       </w:r>
     </w:p>
     <w:p>
       <w:pPr>
-        <w:pStyle w:val="ListParagraph"/>
-        <w:numPr>
-          <w:ilvl w:val="0"/>
-          <w:numId w:val="11"/>
-        </w:numPr>
-        <w:rPr>
-          <w:sz w:val="24"/>
-          <w:szCs w:val="24"/>
-        </w:rPr>
-      </w:pPr>
-      <w:r>
-        <w:rPr>
-          <w:b/>
-          <w:bCs/>
-          <w:sz w:val="24"/>
-          <w:szCs w:val="24"/>
-        </w:rPr>
-        <w:t>Staging Workflow</w:t>
-      </w:r>
-      <w:r>
-        <w:rPr>
-          <w:sz w:val="24"/>
-          <w:szCs w:val="24"/>
-        </w:rPr>
-        <w:t>: Triggered when a release branch is created. Builds and deploys to the staging environment.</w:t>
-      </w:r>
+        <w:pStyle w:val="Caption"/>
+        <w:keepNext/>
+      </w:pPr>
+      <w:r>
+        <w:t xml:space="preserve">Table </w:t>
+      </w:r>
+      <w:fldSimple w:instr=" SEQ Table \* ARABIC ">
+        <w:r>
+          <w:rPr>
+            <w:noProof/>
+          </w:rPr>
+          <w:t>2</w:t>
+        </w:r>
+      </w:fldSimple>
+    </w:p>
+    <w:tbl>
+      <w:tblPr>
+        <w:tblStyle w:val="TableGrid"/>
+        <w:tblW w:w="0" w:type="auto"/>
+        <w:tblLook w:val="04A0" w:firstRow="1" w:lastRow="0" w:firstColumn="1" w:lastColumn="0" w:noHBand="0" w:noVBand="1"/>
+      </w:tblPr>
+      <w:tblGrid>
+        <w:gridCol w:w="1568"/>
+        <w:gridCol w:w="2907"/>
+        <w:gridCol w:w="4875"/>
+      </w:tblGrid>
+      <w:tr>
+        <w:tc>
+          <w:tcPr>
+            <w:tcW w:w="0" w:type="auto"/>
+            <w:shd w:val="clear" w:color="auto" w:fill="FFD966" w:themeFill="accent4" w:themeFillTint="99"/>
+            <w:vAlign w:val="bottom"/>
+            <w:hideMark/>
+          </w:tcPr>
+          <w:p>
+            <w:pPr>
+              <w:spacing w:after="160" w:line="259" w:lineRule="auto"/>
+              <w:jc w:val="center"/>
+              <w:rPr>
+                <w:b/>
+                <w:bCs/>
+                <w:sz w:val="24"/>
+                <w:szCs w:val="24"/>
+              </w:rPr>
+            </w:pPr>
+            <w:r>
+              <w:rPr>
+                <w:b/>
+                <w:bCs/>
+                <w:sz w:val="24"/>
+                <w:szCs w:val="24"/>
+              </w:rPr>
+              <w:t>Environment</w:t>
+            </w:r>
+          </w:p>
+        </w:tc>
+        <w:tc>
+          <w:tcPr>
+            <w:tcW w:w="0" w:type="auto"/>
+            <w:shd w:val="clear" w:color="auto" w:fill="FFD966" w:themeFill="accent4" w:themeFillTint="99"/>
+            <w:vAlign w:val="bottom"/>
+            <w:hideMark/>
+          </w:tcPr>
+          <w:p>
+            <w:pPr>
+              <w:spacing w:after="160" w:line="259" w:lineRule="auto"/>
+              <w:jc w:val="center"/>
+              <w:rPr>
+                <w:b/>
+                <w:bCs/>
+                <w:sz w:val="24"/>
+                <w:szCs w:val="24"/>
+              </w:rPr>
+            </w:pPr>
+            <w:r>
+              <w:rPr>
+                <w:b/>
+                <w:bCs/>
+                <w:sz w:val="24"/>
+                <w:szCs w:val="24"/>
+              </w:rPr>
+              <w:t>Trigger Event</w:t>
+            </w:r>
+          </w:p>
+        </w:tc>
+        <w:tc>
+          <w:tcPr>
+            <w:tcW w:w="0" w:type="auto"/>
+            <w:shd w:val="clear" w:color="auto" w:fill="FFD966" w:themeFill="accent4" w:themeFillTint="99"/>
+            <w:vAlign w:val="bottom"/>
+            <w:hideMark/>
+          </w:tcPr>
+          <w:p>
+            <w:pPr>
+              <w:spacing w:after="160" w:line="259" w:lineRule="auto"/>
+              <w:jc w:val="center"/>
+              <w:rPr>
+                <w:b/>
+                <w:bCs/>
+                <w:sz w:val="24"/>
+                <w:szCs w:val="24"/>
+              </w:rPr>
+            </w:pPr>
+            <w:r>
+              <w:rPr>
+                <w:b/>
+                <w:bCs/>
+                <w:sz w:val="24"/>
+                <w:szCs w:val="24"/>
+              </w:rPr>
+              <w:t>Actions</w:t>
+            </w:r>
+          </w:p>
+        </w:tc>
+      </w:tr>
+      <w:tr>
+        <w:tc>
+          <w:tcPr>
+            <w:tcW w:w="0" w:type="auto"/>
+            <w:vMerge w:val="restart"/>
+            <w:vAlign w:val="center"/>
+            <w:hideMark/>
+          </w:tcPr>
+          <w:p>
+            <w:pPr>
+              <w:spacing w:after="160" w:line="259" w:lineRule="auto"/>
+              <w:jc w:val="center"/>
+              <w:rPr>
+                <w:sz w:val="24"/>
+                <w:szCs w:val="24"/>
+              </w:rPr>
+            </w:pPr>
+            <w:r>
+              <w:rPr>
+                <w:b/>
+                <w:bCs/>
+                <w:sz w:val="24"/>
+                <w:szCs w:val="24"/>
+              </w:rPr>
+              <w:t>Development</w:t>
+            </w:r>
+          </w:p>
+        </w:tc>
+        <w:tc>
+          <w:tcPr>
+            <w:tcW w:w="0" w:type="auto"/>
+            <w:hideMark/>
+          </w:tcPr>
+          <w:p>
+            <w:pPr>
+              <w:spacing w:after="160" w:line="259" w:lineRule="auto"/>
+              <w:rPr>
+                <w:sz w:val="24"/>
+                <w:szCs w:val="24"/>
+              </w:rPr>
+            </w:pPr>
+            <w:r>
+              <w:rPr>
+                <w:sz w:val="24"/>
+                <w:szCs w:val="24"/>
+              </w:rPr>
+              <w:t>PR creation (feature/* → develop)</w:t>
+            </w:r>
+          </w:p>
+        </w:tc>
+        <w:tc>
+          <w:tcPr>
+            <w:tcW w:w="0" w:type="auto"/>
+            <w:hideMark/>
+          </w:tcPr>
+          <w:p>
+            <w:pPr>
+              <w:spacing w:after="160" w:line="259" w:lineRule="auto"/>
+              <w:rPr>
+                <w:sz w:val="24"/>
+                <w:szCs w:val="24"/>
+              </w:rPr>
+            </w:pPr>
+            <w:r>
+              <w:rPr>
+                <w:sz w:val="24"/>
+                <w:szCs w:val="24"/>
+              </w:rPr>
+              <w:t xml:space="preserve">A </w:t>
+            </w:r>
+            <w:r>
+              <w:rPr>
+                <w:b/>
+                <w:bCs/>
+                <w:sz w:val="24"/>
+                <w:szCs w:val="24"/>
+              </w:rPr>
+              <w:t>CI Pipeline</w:t>
+            </w:r>
+            <w:r>
+              <w:rPr>
+                <w:sz w:val="24"/>
+                <w:szCs w:val="24"/>
+              </w:rPr>
+              <w:t xml:space="preserve"> for </w:t>
+            </w:r>
+            <w:r>
+              <w:rPr>
+                <w:sz w:val="24"/>
+                <w:szCs w:val="24"/>
+              </w:rPr>
+              <w:t>Lint</w:t>
+            </w:r>
+            <w:r>
+              <w:rPr>
+                <w:sz w:val="24"/>
+                <w:szCs w:val="24"/>
+              </w:rPr>
+              <w:t>ing, Building</w:t>
+            </w:r>
+            <w:r>
+              <w:rPr>
+                <w:sz w:val="24"/>
+                <w:szCs w:val="24"/>
+              </w:rPr>
+              <w:t>.</w:t>
+            </w:r>
+            <w:r>
+              <w:rPr>
+                <w:sz w:val="24"/>
+                <w:szCs w:val="24"/>
+              </w:rPr>
+              <w:t xml:space="preserve"> No Deployment here. </w:t>
+            </w:r>
+          </w:p>
+        </w:tc>
+      </w:tr>
+      <w:tr>
+        <w:tc>
+          <w:tcPr>
+            <w:tcW w:w="0" w:type="auto"/>
+            <w:vMerge/>
+            <w:hideMark/>
+          </w:tcPr>
+          <w:p>
+            <w:pPr>
+              <w:spacing w:after="160" w:line="259" w:lineRule="auto"/>
+              <w:rPr>
+                <w:b/>
+                <w:bCs/>
+                <w:sz w:val="24"/>
+                <w:szCs w:val="24"/>
+              </w:rPr>
+            </w:pPr>
+          </w:p>
+        </w:tc>
+        <w:tc>
+          <w:tcPr>
+            <w:tcW w:w="0" w:type="auto"/>
+            <w:hideMark/>
+          </w:tcPr>
+          <w:p>
+            <w:pPr>
+              <w:spacing w:after="160" w:line="259" w:lineRule="auto"/>
+              <w:rPr>
+                <w:sz w:val="24"/>
+                <w:szCs w:val="24"/>
+              </w:rPr>
+            </w:pPr>
+            <w:r>
+              <w:rPr>
+                <w:sz w:val="24"/>
+                <w:szCs w:val="24"/>
+              </w:rPr>
+              <w:t>PR merged into develop</w:t>
+            </w:r>
+            <w:r>
+              <w:rPr>
+                <w:sz w:val="24"/>
+                <w:szCs w:val="24"/>
+              </w:rPr>
+              <w:t>/ New Commits on Development</w:t>
+            </w:r>
+          </w:p>
+        </w:tc>
+        <w:tc>
+          <w:tcPr>
+            <w:tcW w:w="0" w:type="auto"/>
+            <w:hideMark/>
+          </w:tcPr>
+          <w:p>
+            <w:pPr>
+              <w:spacing w:after="160" w:line="259" w:lineRule="auto"/>
+              <w:rPr>
+                <w:sz w:val="24"/>
+                <w:szCs w:val="24"/>
+              </w:rPr>
+            </w:pPr>
+            <w:r>
+              <w:rPr>
+                <w:sz w:val="24"/>
+                <w:szCs w:val="24"/>
+              </w:rPr>
+              <w:t xml:space="preserve">A </w:t>
+            </w:r>
+            <w:r>
+              <w:rPr>
+                <w:b/>
+                <w:bCs/>
+                <w:sz w:val="24"/>
+                <w:szCs w:val="24"/>
+              </w:rPr>
+              <w:t>CD Pipeline</w:t>
+            </w:r>
+            <w:r>
+              <w:rPr>
+                <w:sz w:val="24"/>
+                <w:szCs w:val="24"/>
+              </w:rPr>
+              <w:t xml:space="preserve"> for deploying create the build artifacts and then deploy these artifacts</w:t>
+            </w:r>
+            <w:r>
+              <w:rPr>
+                <w:sz w:val="24"/>
+                <w:szCs w:val="24"/>
+              </w:rPr>
+              <w:t xml:space="preserve"> to</w:t>
+            </w:r>
+            <w:r>
+              <w:rPr>
+                <w:sz w:val="24"/>
+                <w:szCs w:val="24"/>
+              </w:rPr>
+              <w:t xml:space="preserve"> the</w:t>
+            </w:r>
+            <w:r>
+              <w:rPr>
+                <w:sz w:val="24"/>
+                <w:szCs w:val="24"/>
+              </w:rPr>
+              <w:t xml:space="preserve"> </w:t>
+            </w:r>
+            <w:r>
+              <w:rPr>
+                <w:sz w:val="24"/>
+                <w:szCs w:val="24"/>
+              </w:rPr>
+              <w:t>development environment</w:t>
+            </w:r>
+            <w:r>
+              <w:rPr>
+                <w:sz w:val="24"/>
+                <w:szCs w:val="24"/>
+              </w:rPr>
+              <w:t xml:space="preserve">. </w:t>
+            </w:r>
+          </w:p>
+        </w:tc>
+      </w:tr>
+      <w:tr>
+        <w:tc>
+          <w:tcPr>
+            <w:tcW w:w="0" w:type="auto"/>
+            <w:vMerge w:val="restart"/>
+            <w:vAlign w:val="center"/>
+            <w:hideMark/>
+          </w:tcPr>
+          <w:p>
+            <w:pPr>
+              <w:spacing w:after="160" w:line="259" w:lineRule="auto"/>
+              <w:jc w:val="center"/>
+              <w:rPr>
+                <w:sz w:val="24"/>
+                <w:szCs w:val="24"/>
+              </w:rPr>
+            </w:pPr>
+            <w:r>
+              <w:rPr>
+                <w:b/>
+                <w:bCs/>
+                <w:sz w:val="24"/>
+                <w:szCs w:val="24"/>
+              </w:rPr>
+              <w:t>Staging</w:t>
+            </w:r>
+          </w:p>
+        </w:tc>
+        <w:tc>
+          <w:tcPr>
+            <w:tcW w:w="0" w:type="auto"/>
+            <w:hideMark/>
+          </w:tcPr>
+          <w:p>
+            <w:pPr>
+              <w:spacing w:after="160" w:line="259" w:lineRule="auto"/>
+              <w:rPr>
+                <w:sz w:val="24"/>
+                <w:szCs w:val="24"/>
+              </w:rPr>
+            </w:pPr>
+            <w:r>
+              <w:rPr>
+                <w:sz w:val="24"/>
+                <w:szCs w:val="24"/>
+              </w:rPr>
+              <w:t>New commits to release</w:t>
+            </w:r>
+          </w:p>
+        </w:tc>
+        <w:tc>
+          <w:tcPr>
+            <w:tcW w:w="0" w:type="auto"/>
+            <w:hideMark/>
+          </w:tcPr>
+          <w:p>
+            <w:pPr>
+              <w:spacing w:after="160" w:line="259" w:lineRule="auto"/>
+              <w:rPr>
+                <w:sz w:val="24"/>
+                <w:szCs w:val="24"/>
+              </w:rPr>
+            </w:pPr>
+            <w:r>
+              <w:rPr>
+                <w:sz w:val="24"/>
+                <w:szCs w:val="24"/>
+              </w:rPr>
+              <w:t>A</w:t>
+            </w:r>
+            <w:r>
+              <w:rPr>
+                <w:sz w:val="24"/>
+                <w:szCs w:val="24"/>
+              </w:rPr>
+              <w:t xml:space="preserve"> </w:t>
+            </w:r>
+            <w:r>
+              <w:rPr>
+                <w:b/>
+                <w:bCs/>
+                <w:sz w:val="24"/>
+                <w:szCs w:val="24"/>
+              </w:rPr>
+              <w:t>C</w:t>
+            </w:r>
+            <w:r>
+              <w:rPr>
+                <w:b/>
+                <w:bCs/>
+                <w:sz w:val="24"/>
+                <w:szCs w:val="24"/>
+              </w:rPr>
+              <w:t>D</w:t>
+            </w:r>
+            <w:r>
+              <w:rPr>
+                <w:b/>
+                <w:bCs/>
+                <w:sz w:val="24"/>
+                <w:szCs w:val="24"/>
+              </w:rPr>
+              <w:t xml:space="preserve"> </w:t>
+            </w:r>
+            <w:r>
+              <w:rPr>
+                <w:b/>
+                <w:bCs/>
+                <w:sz w:val="24"/>
+                <w:szCs w:val="24"/>
+              </w:rPr>
+              <w:t>P</w:t>
+            </w:r>
+            <w:r>
+              <w:rPr>
+                <w:b/>
+                <w:bCs/>
+                <w:sz w:val="24"/>
+                <w:szCs w:val="24"/>
+              </w:rPr>
+              <w:t>ipeline</w:t>
+            </w:r>
+            <w:r>
+              <w:rPr>
+                <w:sz w:val="24"/>
+                <w:szCs w:val="24"/>
+              </w:rPr>
+              <w:t xml:space="preserve"> for building and Deployment to the staging environment.</w:t>
+            </w:r>
+          </w:p>
+        </w:tc>
+      </w:tr>
+      <w:tr>
+        <w:tc>
+          <w:tcPr>
+            <w:tcW w:w="0" w:type="auto"/>
+            <w:vMerge/>
+            <w:hideMark/>
+          </w:tcPr>
+          <w:p>
+            <w:pPr>
+              <w:spacing w:after="160" w:line="259" w:lineRule="auto"/>
+              <w:rPr>
+                <w:sz w:val="24"/>
+                <w:szCs w:val="24"/>
+              </w:rPr>
+            </w:pPr>
+          </w:p>
+        </w:tc>
+        <w:tc>
+          <w:tcPr>
+            <w:tcW w:w="0" w:type="auto"/>
+            <w:hideMark/>
+          </w:tcPr>
+          <w:p>
+            <w:pPr>
+              <w:spacing w:after="160" w:line="259" w:lineRule="auto"/>
+              <w:rPr>
+                <w:sz w:val="24"/>
+                <w:szCs w:val="24"/>
+              </w:rPr>
+            </w:pPr>
+            <w:r>
+              <w:rPr>
+                <w:sz w:val="24"/>
+                <w:szCs w:val="24"/>
+              </w:rPr>
+              <w:t>PR creation (bugfix/* → release)</w:t>
+            </w:r>
+          </w:p>
+        </w:tc>
+        <w:tc>
+          <w:tcPr>
+            <w:tcW w:w="0" w:type="auto"/>
+            <w:hideMark/>
+          </w:tcPr>
+          <w:p>
+            <w:pPr>
+              <w:spacing w:after="160" w:line="259" w:lineRule="auto"/>
+              <w:rPr>
+                <w:sz w:val="24"/>
+                <w:szCs w:val="24"/>
+              </w:rPr>
+            </w:pPr>
+            <w:r>
+              <w:rPr>
+                <w:sz w:val="24"/>
+                <w:szCs w:val="24"/>
+              </w:rPr>
+              <w:t xml:space="preserve">A </w:t>
+            </w:r>
+            <w:r>
+              <w:rPr>
+                <w:b/>
+                <w:bCs/>
+                <w:sz w:val="24"/>
+                <w:szCs w:val="24"/>
+              </w:rPr>
+              <w:t>CI Pipeline</w:t>
+            </w:r>
+            <w:r>
+              <w:rPr>
+                <w:sz w:val="24"/>
+                <w:szCs w:val="24"/>
+              </w:rPr>
+              <w:t xml:space="preserve"> to </w:t>
+            </w:r>
+            <w:r>
+              <w:rPr>
+                <w:sz w:val="24"/>
+                <w:szCs w:val="24"/>
+              </w:rPr>
+              <w:t>Validate bug fix (tests, build, analysis).</w:t>
+            </w:r>
+          </w:p>
+        </w:tc>
+      </w:tr>
+      <w:tr>
+        <w:tc>
+          <w:tcPr>
+            <w:tcW w:w="0" w:type="auto"/>
+            <w:vMerge w:val="restart"/>
+            <w:vAlign w:val="center"/>
+            <w:hideMark/>
+          </w:tcPr>
+          <w:p>
+            <w:pPr>
+              <w:spacing w:after="160" w:line="259" w:lineRule="auto"/>
+              <w:jc w:val="center"/>
+              <w:rPr>
+                <w:sz w:val="24"/>
+                <w:szCs w:val="24"/>
+              </w:rPr>
+            </w:pPr>
+            <w:r>
+              <w:rPr>
+                <w:b/>
+                <w:bCs/>
+                <w:sz w:val="24"/>
+                <w:szCs w:val="24"/>
+              </w:rPr>
+              <w:t>Production</w:t>
+            </w:r>
+          </w:p>
+        </w:tc>
+        <w:tc>
+          <w:tcPr>
+            <w:tcW w:w="0" w:type="auto"/>
+            <w:hideMark/>
+          </w:tcPr>
+          <w:p>
+            <w:pPr>
+              <w:spacing w:after="160" w:line="259" w:lineRule="auto"/>
+              <w:rPr>
+                <w:sz w:val="24"/>
+                <w:szCs w:val="24"/>
+              </w:rPr>
+            </w:pPr>
+            <w:r>
+              <w:rPr>
+                <w:sz w:val="24"/>
+                <w:szCs w:val="24"/>
+              </w:rPr>
+              <w:t>PR creation (release → production)</w:t>
+            </w:r>
+          </w:p>
+        </w:tc>
+        <w:tc>
+          <w:tcPr>
+            <w:tcW w:w="0" w:type="auto"/>
+            <w:hideMark/>
+          </w:tcPr>
+          <w:p>
+            <w:pPr>
+              <w:spacing w:after="160" w:line="259" w:lineRule="auto"/>
+              <w:rPr>
+                <w:sz w:val="24"/>
+                <w:szCs w:val="24"/>
+              </w:rPr>
+            </w:pPr>
+            <w:r>
+              <w:rPr>
+                <w:sz w:val="24"/>
+                <w:szCs w:val="24"/>
+              </w:rPr>
+              <w:t xml:space="preserve">A </w:t>
+            </w:r>
+            <w:r>
+              <w:rPr>
+                <w:b/>
+                <w:bCs/>
+                <w:sz w:val="24"/>
+                <w:szCs w:val="24"/>
+              </w:rPr>
+              <w:t>CI Pipeline</w:t>
+            </w:r>
+            <w:r>
+              <w:rPr>
+                <w:sz w:val="24"/>
+                <w:szCs w:val="24"/>
+              </w:rPr>
+              <w:t xml:space="preserve"> to </w:t>
+            </w:r>
+            <w:r>
+              <w:rPr>
+                <w:sz w:val="24"/>
+                <w:szCs w:val="24"/>
+              </w:rPr>
+              <w:t>Run final tests</w:t>
+            </w:r>
+            <w:r>
+              <w:rPr>
+                <w:sz w:val="24"/>
+                <w:szCs w:val="24"/>
+              </w:rPr>
+              <w:t>, linting and building</w:t>
+            </w:r>
+            <w:r>
+              <w:rPr>
+                <w:sz w:val="24"/>
+                <w:szCs w:val="24"/>
+              </w:rPr>
+              <w:t>.</w:t>
+            </w:r>
+          </w:p>
+        </w:tc>
+      </w:tr>
+      <w:tr>
+        <w:tc>
+          <w:tcPr>
+            <w:tcW w:w="0" w:type="auto"/>
+            <w:vMerge/>
+            <w:hideMark/>
+          </w:tcPr>
+          <w:p>
+            <w:pPr>
+              <w:spacing w:after="160" w:line="259" w:lineRule="auto"/>
+              <w:rPr>
+                <w:sz w:val="24"/>
+                <w:szCs w:val="24"/>
+              </w:rPr>
+            </w:pPr>
+          </w:p>
+        </w:tc>
+        <w:tc>
+          <w:tcPr>
+            <w:tcW w:w="0" w:type="auto"/>
+            <w:hideMark/>
+          </w:tcPr>
+          <w:p>
+            <w:pPr>
+              <w:spacing w:after="160" w:line="259" w:lineRule="auto"/>
+              <w:rPr>
+                <w:sz w:val="24"/>
+                <w:szCs w:val="24"/>
+              </w:rPr>
+            </w:pPr>
+            <w:r>
+              <w:rPr>
+                <w:sz w:val="24"/>
+                <w:szCs w:val="24"/>
+              </w:rPr>
+              <w:t>PR merged into production</w:t>
+            </w:r>
+          </w:p>
+        </w:tc>
+        <w:tc>
+          <w:tcPr>
+            <w:tcW w:w="0" w:type="auto"/>
+            <w:hideMark/>
+          </w:tcPr>
+          <w:p>
+            <w:pPr>
+              <w:spacing w:after="160" w:line="259" w:lineRule="auto"/>
+              <w:rPr>
+                <w:sz w:val="24"/>
+                <w:szCs w:val="24"/>
+              </w:rPr>
+            </w:pPr>
+            <w:r>
+              <w:rPr>
+                <w:sz w:val="24"/>
+                <w:szCs w:val="24"/>
+              </w:rPr>
+              <w:t xml:space="preserve">A </w:t>
+            </w:r>
+            <w:r>
+              <w:rPr>
+                <w:b/>
+                <w:bCs/>
+                <w:sz w:val="24"/>
+                <w:szCs w:val="24"/>
+              </w:rPr>
+              <w:t>CD Pipeline</w:t>
+            </w:r>
+            <w:r>
+              <w:rPr>
+                <w:sz w:val="24"/>
+                <w:szCs w:val="24"/>
+              </w:rPr>
+              <w:t xml:space="preserve"> </w:t>
+            </w:r>
+            <w:r>
+              <w:rPr>
+                <w:sz w:val="24"/>
+                <w:szCs w:val="24"/>
+              </w:rPr>
+              <w:t>Deploy to production</w:t>
+            </w:r>
+            <w:r>
+              <w:rPr>
+                <w:sz w:val="24"/>
+                <w:szCs w:val="24"/>
+              </w:rPr>
+              <w:t xml:space="preserve"> environment</w:t>
+            </w:r>
+            <w:r>
+              <w:rPr>
+                <w:sz w:val="24"/>
+                <w:szCs w:val="24"/>
+              </w:rPr>
+              <w:t xml:space="preserve">. Require manual approval </w:t>
+            </w:r>
+          </w:p>
+        </w:tc>
+      </w:tr>
+    </w:tbl>
+    <w:p>
+      <w:pPr>
+        <w:ind w:left="540"/>
+        <w:rPr>
+          <w:sz w:val="24"/>
+          <w:szCs w:val="24"/>
+        </w:rPr>
+      </w:pPr>
     </w:p>
     <w:p>
       <w:pPr>
-        <w:pStyle w:val="ListParagraph"/>
-        <w:numPr>
-          <w:ilvl w:val="0"/>
-          <w:numId w:val="11"/>
-        </w:numPr>
-      </w:pPr>
-      <w:r>
-        <w:rPr>
-          <w:b/>
-          <w:bCs/>
-          <w:sz w:val="24"/>
-          <w:szCs w:val="24"/>
-        </w:rPr>
-        <w:t>Production Workflow</w:t>
-      </w:r>
-      <w:r>
-        <w:rPr>
-          <w:sz w:val="24"/>
-          <w:szCs w:val="24"/>
-        </w:rPr>
-        <w:t>: Triggered on pushes to the production branch. Deploys the finalized website to the production environment.</w:t>
-      </w:r>
-    </w:p>
-    <w:p>
-      <w:pPr>
         <w:ind w:left="540"/>
         <w:rPr>
           <w:sz w:val="24"/>
@@ -2536,7 +3548,30 @@
           <w:sz w:val="24"/>
           <w:szCs w:val="24"/>
         </w:rPr>
-        <w:t>3.2. Each workflow must use GitHub Actions and include linting, building (using Parcel), and deployment.</w:t>
+        <w:t xml:space="preserve">3.2. </w:t>
+      </w:r>
+      <w:r>
+        <w:rPr>
+          <w:sz w:val="24"/>
+          <w:szCs w:val="24"/>
+        </w:rPr>
+        <w:t xml:space="preserve">Each workflow must be created in a separate feature branch. </w:t>
+      </w:r>
+      <w:r>
+        <w:rPr>
+          <w:b/>
+          <w:bCs/>
+          <w:sz w:val="24"/>
+          <w:szCs w:val="24"/>
+        </w:rPr>
+        <w:t>Each team member must work on one workflow creation</w:t>
+      </w:r>
+      <w:r>
+        <w:rPr>
+          <w:sz w:val="24"/>
+          <w:szCs w:val="24"/>
+        </w:rPr>
+        <w:t xml:space="preserve">. </w:t>
       </w:r>
     </w:p>
     <w:p>
@@ -2702,7 +3737,6 @@
           <w:sz w:val="28"/>
           <w:szCs w:val="28"/>
         </w:rPr>
-        <w:lastRenderedPageBreak/>
         <w:t>Website Feature Development</w:t>
       </w:r>
     </w:p>
@@ -2741,6 +3775,7 @@
         <w:br/>
         <w:t>5.2. Develop the HTML and CSS files for the assigned page, adhering to linting rules (</w:t>
       </w:r>
+      <w:proofErr w:type="spellStart"/>
       <w:r>
         <w:rPr>
           <w:b/>
@@ -2750,6 +3785,7 @@
         </w:rPr>
         <w:t>HTMLHint</w:t>
       </w:r>
+      <w:proofErr w:type="spellEnd"/>
       <w:r>
         <w:rPr>
           <w:sz w:val="24"/>
@@ -2757,6 +3793,7 @@
         </w:rPr>
         <w:t xml:space="preserve"> and </w:t>
       </w:r>
+      <w:proofErr w:type="spellStart"/>
       <w:r>
         <w:rPr>
           <w:b/>
@@ -2766,6 +3803,7 @@
         </w:rPr>
         <w:t>Stylelint</w:t>
       </w:r>
+      <w:proofErr w:type="spellEnd"/>
       <w:r>
         <w:rPr>
           <w:sz w:val="24"/>

</xml_diff>